<commit_message>
Kurs ishi: har bir rejaga qo'shimcha jadval, jadval va rasm nomlari qalin
Co-Authored-By: Claude Opus 5.5 <noreply@anthropic.com>
Claude-Session: https://claude.ai/code/session_01SPUXgDHyaKJrV6o5CiPGr8
</commit_message>
<xml_diff>
--- a/kurs_ishi/kurs_ishi_tahrirlangan.docx
+++ b/kurs_ishi/kurs_ishi_tahrirlangan.docx
@@ -900,6 +900,513 @@
         <w:footnoteReference w:id="3"/>
       </w:r>
     </w:p>
+    <w:tbl>
+      <w:tblPr>
+        <w:tblStyle w:val="style154"/>
+        <w:tblW w:w="5000" w:type="pct"/>
+        <w:jc w:val="center"/>
+        <w:tblLook w:val="04A0" w:firstRow="1" w:lastRow="0" w:firstColumn="1" w:lastColumn="0" w:noHBand="0" w:noVBand="1"/>
+      </w:tblPr>
+      <w:tblGrid>
+        <w:gridCol w:w="2423"/>
+        <w:gridCol w:w="2423"/>
+        <w:gridCol w:w="2423"/>
+        <w:gridCol w:w="2423"/>
+      </w:tblGrid>
+      <w:tr>
+        <w:trPr>
+          <w:jc w:val="center"/>
+        </w:trPr>
+        <w:tc>
+          <w:tcPr>
+            <w:tcW w:w="2423" w:type="dxa"/>
+            <w:tcBorders/>
+            <w:shd w:val="clear" w:color="auto" w:fill="d6e4f0"/>
+          </w:tcPr>
+          <w:p>
+            <w:pPr>
+              <w:pStyle w:val="style0"/>
+              <w:spacing w:before="0" w:after="0"/>
+              <w:jc w:val="center"/>
+              <w:rPr/>
+            </w:pPr>
+            <w:r>
+              <w:rPr>
+                <w:rFonts w:ascii="Times New Roman" w:hAnsi="Times New Roman"/>
+                <w:b/>
+                <w:sz w:val="22"/>
+              </w:rPr>
+              <w:t xml:space="preserve">Mamlakat (model)</w:t>
+            </w:r>
+          </w:p>
+        </w:tc>
+        <w:tc>
+          <w:tcPr>
+            <w:tcW w:w="2423" w:type="dxa"/>
+            <w:tcBorders/>
+            <w:shd w:val="clear" w:color="auto" w:fill="d6e4f0"/>
+          </w:tcPr>
+          <w:p>
+            <w:pPr>
+              <w:pStyle w:val="style0"/>
+              <w:spacing w:before="0" w:after="0"/>
+              <w:jc w:val="center"/>
+              <w:rPr/>
+            </w:pPr>
+            <w:r>
+              <w:rPr>
+                <w:rFonts w:ascii="Times New Roman" w:hAnsi="Times New Roman"/>
+                <w:b/>
+                <w:sz w:val="22"/>
+              </w:rPr>
+              <w:t xml:space="preserve">Yerga egalik shakli</w:t>
+            </w:r>
+          </w:p>
+        </w:tc>
+        <w:tc>
+          <w:tcPr>
+            <w:tcW w:w="2423" w:type="dxa"/>
+            <w:tcBorders/>
+            <w:shd w:val="clear" w:color="auto" w:fill="d6e4f0"/>
+          </w:tcPr>
+          <w:p>
+            <w:pPr>
+              <w:pStyle w:val="style0"/>
+              <w:spacing w:before="0" w:after="0"/>
+              <w:jc w:val="center"/>
+              <w:rPr/>
+            </w:pPr>
+            <w:r>
+              <w:rPr>
+                <w:rFonts w:ascii="Times New Roman" w:hAnsi="Times New Roman"/>
+                <w:b/>
+                <w:sz w:val="22"/>
+              </w:rPr>
+              <w:t xml:space="preserve">Asosiy xo'jalik yurituvchi sub'ekt</w:t>
+            </w:r>
+          </w:p>
+        </w:tc>
+        <w:tc>
+          <w:tcPr>
+            <w:tcW w:w="2423" w:type="dxa"/>
+            <w:tcBorders/>
+            <w:shd w:val="clear" w:color="auto" w:fill="d6e4f0"/>
+          </w:tcPr>
+          <w:p>
+            <w:pPr>
+              <w:pStyle w:val="style0"/>
+              <w:spacing w:before="0" w:after="0"/>
+              <w:jc w:val="center"/>
+              <w:rPr/>
+            </w:pPr>
+            <w:r>
+              <w:rPr>
+                <w:rFonts w:ascii="Times New Roman" w:hAnsi="Times New Roman"/>
+                <w:b/>
+                <w:sz w:val="22"/>
+              </w:rPr>
+              <w:t xml:space="preserve">O'zbekiston uchun ahamiyati</w:t>
+            </w:r>
+          </w:p>
+        </w:tc>
+      </w:tr>
+      <w:tr>
+        <w:tblPrEx/>
+        <w:trPr>
+          <w:jc w:val="center"/>
+        </w:trPr>
+        <w:tc>
+          <w:tcPr>
+            <w:tcW w:w="2423" w:type="dxa"/>
+            <w:tcBorders/>
+          </w:tcPr>
+          <w:p>
+            <w:pPr>
+              <w:pStyle w:val="style0"/>
+              <w:spacing w:before="0" w:after="0"/>
+              <w:jc w:val="center"/>
+              <w:rPr/>
+            </w:pPr>
+            <w:r>
+              <w:rPr>
+                <w:rFonts w:ascii="Times New Roman" w:hAnsi="Times New Roman"/>
+                <w:b/>
+                <w:sz w:val="22"/>
+              </w:rPr>
+              <w:t xml:space="preserve">AQSh</w:t>
+            </w:r>
+          </w:p>
+        </w:tc>
+        <w:tc>
+          <w:tcPr>
+            <w:tcW w:w="2423" w:type="dxa"/>
+            <w:tcBorders/>
+          </w:tcPr>
+          <w:p>
+            <w:pPr>
+              <w:pStyle w:val="style0"/>
+              <w:spacing w:before="0" w:after="0"/>
+              <w:jc w:val="center"/>
+              <w:rPr/>
+            </w:pPr>
+            <w:r>
+              <w:rPr>
+                <w:rFonts w:ascii="Times New Roman" w:hAnsi="Times New Roman"/>
+                <w:sz w:val="22"/>
+              </w:rPr>
+              <w:t xml:space="preserve">Xususiy mulk ustun</w:t>
+            </w:r>
+          </w:p>
+        </w:tc>
+        <w:tc>
+          <w:tcPr>
+            <w:tcW w:w="2423" w:type="dxa"/>
+            <w:tcBorders/>
+          </w:tcPr>
+          <w:p>
+            <w:pPr>
+              <w:pStyle w:val="style0"/>
+              <w:spacing w:before="0" w:after="0"/>
+              <w:jc w:val="center"/>
+              <w:rPr/>
+            </w:pPr>
+            <w:r>
+              <w:rPr>
+                <w:rFonts w:ascii="Times New Roman" w:hAnsi="Times New Roman"/>
+                <w:sz w:val="22"/>
+              </w:rPr>
+              <w:t xml:space="preserve">Yirik fermer xo'jaliklari va agrobiznes korporatsiyalari</w:t>
+            </w:r>
+          </w:p>
+        </w:tc>
+        <w:tc>
+          <w:tcPr>
+            <w:tcW w:w="2423" w:type="dxa"/>
+            <w:tcBorders/>
+          </w:tcPr>
+          <w:p>
+            <w:pPr>
+              <w:pStyle w:val="style0"/>
+              <w:spacing w:before="0" w:after="0"/>
+              <w:jc w:val="center"/>
+              <w:rPr/>
+            </w:pPr>
+            <w:r>
+              <w:rPr>
+                <w:rFonts w:ascii="Times New Roman" w:hAnsi="Times New Roman"/>
+                <w:sz w:val="22"/>
+              </w:rPr>
+              <w:t xml:space="preserve">Texnologik jihozlash va agrobiznes integratsiyasi tajribasi</w:t>
+            </w:r>
+          </w:p>
+        </w:tc>
+      </w:tr>
+      <w:tr>
+        <w:tblPrEx/>
+        <w:trPr>
+          <w:jc w:val="center"/>
+        </w:trPr>
+        <w:tc>
+          <w:tcPr>
+            <w:tcW w:w="2423" w:type="dxa"/>
+            <w:tcBorders/>
+          </w:tcPr>
+          <w:p>
+            <w:pPr>
+              <w:pStyle w:val="style0"/>
+              <w:spacing w:before="0" w:after="0"/>
+              <w:jc w:val="center"/>
+              <w:rPr/>
+            </w:pPr>
+            <w:r>
+              <w:rPr>
+                <w:rFonts w:ascii="Times New Roman" w:hAnsi="Times New Roman"/>
+                <w:b/>
+                <w:sz w:val="22"/>
+              </w:rPr>
+              <w:t xml:space="preserve">Yevropa Ittifoqi</w:t>
+            </w:r>
+          </w:p>
+        </w:tc>
+        <w:tc>
+          <w:tcPr>
+            <w:tcW w:w="2423" w:type="dxa"/>
+            <w:tcBorders/>
+          </w:tcPr>
+          <w:p>
+            <w:pPr>
+              <w:pStyle w:val="style0"/>
+              <w:spacing w:before="0" w:after="0"/>
+              <w:jc w:val="center"/>
+              <w:rPr/>
+            </w:pPr>
+            <w:r>
+              <w:rPr>
+                <w:rFonts w:ascii="Times New Roman" w:hAnsi="Times New Roman"/>
+                <w:sz w:val="22"/>
+              </w:rPr>
+              <w:t xml:space="preserve">Xususiy mulk, uzoq muddatli ijara</w:t>
+            </w:r>
+          </w:p>
+        </w:tc>
+        <w:tc>
+          <w:tcPr>
+            <w:tcW w:w="2423" w:type="dxa"/>
+            <w:tcBorders/>
+          </w:tcPr>
+          <w:p>
+            <w:pPr>
+              <w:pStyle w:val="style0"/>
+              <w:spacing w:before="0" w:after="0"/>
+              <w:jc w:val="center"/>
+              <w:rPr/>
+            </w:pPr>
+            <w:r>
+              <w:rPr>
+                <w:rFonts w:ascii="Times New Roman" w:hAnsi="Times New Roman"/>
+                <w:sz w:val="22"/>
+              </w:rPr>
+              <w:t xml:space="preserve">Oilaviy fermer xo'jaliklari va kooperativlar</w:t>
+            </w:r>
+          </w:p>
+        </w:tc>
+        <w:tc>
+          <w:tcPr>
+            <w:tcW w:w="2423" w:type="dxa"/>
+            <w:tcBorders/>
+          </w:tcPr>
+          <w:p>
+            <w:pPr>
+              <w:pStyle w:val="style0"/>
+              <w:spacing w:before="0" w:after="0"/>
+              <w:jc w:val="center"/>
+              <w:rPr/>
+            </w:pPr>
+            <w:r>
+              <w:rPr>
+                <w:rFonts w:ascii="Times New Roman" w:hAnsi="Times New Roman"/>
+                <w:sz w:val="22"/>
+              </w:rPr>
+              <w:t xml:space="preserve">Subsidiyalash va kooperatsiya tizimini joriy etish</w:t>
+            </w:r>
+          </w:p>
+        </w:tc>
+      </w:tr>
+      <w:tr>
+        <w:tblPrEx/>
+        <w:trPr>
+          <w:jc w:val="center"/>
+        </w:trPr>
+        <w:tc>
+          <w:tcPr>
+            <w:tcW w:w="2423" w:type="dxa"/>
+            <w:tcBorders/>
+          </w:tcPr>
+          <w:p>
+            <w:pPr>
+              <w:pStyle w:val="style0"/>
+              <w:spacing w:before="0" w:after="0"/>
+              <w:jc w:val="center"/>
+              <w:rPr/>
+            </w:pPr>
+            <w:r>
+              <w:rPr>
+                <w:rFonts w:ascii="Times New Roman" w:hAnsi="Times New Roman"/>
+                <w:b/>
+                <w:sz w:val="22"/>
+              </w:rPr>
+              <w:t xml:space="preserve">Xitoy</w:t>
+            </w:r>
+          </w:p>
+        </w:tc>
+        <w:tc>
+          <w:tcPr>
+            <w:tcW w:w="2423" w:type="dxa"/>
+            <w:tcBorders/>
+          </w:tcPr>
+          <w:p>
+            <w:pPr>
+              <w:pStyle w:val="style0"/>
+              <w:spacing w:before="0" w:after="0"/>
+              <w:jc w:val="center"/>
+              <w:rPr/>
+            </w:pPr>
+            <w:r>
+              <w:rPr>
+                <w:rFonts w:ascii="Times New Roman" w:hAnsi="Times New Roman"/>
+                <w:sz w:val="22"/>
+              </w:rPr>
+              <w:t xml:space="preserve">Yer jamoa mulkida, foydalanish huquqi uy xo'jaliklarida</w:t>
+            </w:r>
+          </w:p>
+        </w:tc>
+        <w:tc>
+          <w:tcPr>
+            <w:tcW w:w="2423" w:type="dxa"/>
+            <w:tcBorders/>
+          </w:tcPr>
+          <w:p>
+            <w:pPr>
+              <w:pStyle w:val="style0"/>
+              <w:spacing w:before="0" w:after="0"/>
+              <w:jc w:val="center"/>
+              <w:rPr/>
+            </w:pPr>
+            <w:r>
+              <w:rPr>
+                <w:rFonts w:ascii="Times New Roman" w:hAnsi="Times New Roman"/>
+                <w:sz w:val="22"/>
+              </w:rPr>
+              <w:t xml:space="preserve">Oilaviy pudrat xo'jaliklari</w:t>
+            </w:r>
+          </w:p>
+        </w:tc>
+        <w:tc>
+          <w:tcPr>
+            <w:tcW w:w="2423" w:type="dxa"/>
+            <w:tcBorders/>
+          </w:tcPr>
+          <w:p>
+            <w:pPr>
+              <w:pStyle w:val="style0"/>
+              <w:spacing w:before="0" w:after="0"/>
+              <w:jc w:val="center"/>
+              <w:rPr/>
+            </w:pPr>
+            <w:r>
+              <w:rPr>
+                <w:rFonts w:ascii="Times New Roman" w:hAnsi="Times New Roman"/>
+                <w:sz w:val="22"/>
+              </w:rPr>
+              <w:t xml:space="preserve">Yerdan foydalanish huquqlarini bosqichma-bosqich isloh qilish</w:t>
+            </w:r>
+          </w:p>
+        </w:tc>
+      </w:tr>
+      <w:tr>
+        <w:tblPrEx/>
+        <w:trPr>
+          <w:jc w:val="center"/>
+        </w:trPr>
+        <w:tc>
+          <w:tcPr>
+            <w:tcW w:w="2423" w:type="dxa"/>
+            <w:tcBorders/>
+          </w:tcPr>
+          <w:p>
+            <w:pPr>
+              <w:pStyle w:val="style0"/>
+              <w:spacing w:before="0" w:after="0"/>
+              <w:jc w:val="center"/>
+              <w:rPr/>
+            </w:pPr>
+            <w:r>
+              <w:rPr>
+                <w:rFonts w:ascii="Times New Roman" w:hAnsi="Times New Roman"/>
+                <w:b/>
+                <w:sz w:val="22"/>
+              </w:rPr>
+              <w:t xml:space="preserve">Isroil</w:t>
+            </w:r>
+          </w:p>
+        </w:tc>
+        <w:tc>
+          <w:tcPr>
+            <w:tcW w:w="2423" w:type="dxa"/>
+            <w:tcBorders/>
+          </w:tcPr>
+          <w:p>
+            <w:pPr>
+              <w:pStyle w:val="style0"/>
+              <w:spacing w:before="0" w:after="0"/>
+              <w:jc w:val="center"/>
+              <w:rPr/>
+            </w:pPr>
+            <w:r>
+              <w:rPr>
+                <w:rFonts w:ascii="Times New Roman" w:hAnsi="Times New Roman"/>
+                <w:sz w:val="22"/>
+              </w:rPr>
+              <w:t xml:space="preserve">Yer asosan davlat mulkida, ijara asosida</w:t>
+            </w:r>
+          </w:p>
+        </w:tc>
+        <w:tc>
+          <w:tcPr>
+            <w:tcW w:w="2423" w:type="dxa"/>
+            <w:tcBorders/>
+          </w:tcPr>
+          <w:p>
+            <w:pPr>
+              <w:pStyle w:val="style0"/>
+              <w:spacing w:before="0" w:after="0"/>
+              <w:jc w:val="center"/>
+              <w:rPr/>
+            </w:pPr>
+            <w:r>
+              <w:rPr>
+                <w:rFonts w:ascii="Times New Roman" w:hAnsi="Times New Roman"/>
+                <w:sz w:val="22"/>
+              </w:rPr>
+              <w:t xml:space="preserve">Kibbutslar va moshavlar</w:t>
+            </w:r>
+          </w:p>
+        </w:tc>
+        <w:tc>
+          <w:tcPr>
+            <w:tcW w:w="2423" w:type="dxa"/>
+            <w:tcBorders/>
+          </w:tcPr>
+          <w:p>
+            <w:pPr>
+              <w:pStyle w:val="style0"/>
+              <w:spacing w:before="0" w:after="0"/>
+              <w:jc w:val="center"/>
+              <w:rPr/>
+            </w:pPr>
+            <w:r>
+              <w:rPr>
+                <w:rFonts w:ascii="Times New Roman" w:hAnsi="Times New Roman"/>
+                <w:sz w:val="22"/>
+              </w:rPr>
+              <w:t xml:space="preserve">Suv tejovchi texnologiyalar va kooperatsiya tajribasi</w:t>
+            </w:r>
+          </w:p>
+        </w:tc>
+      </w:tr>
+    </w:tbl>
+    <w:p>
+      <w:pPr>
+        <w:pStyle w:val="style0"/>
+        <w:spacing w:before="0" w:after="0"/>
+        <w:jc w:val="center"/>
+        <w:rPr/>
+      </w:pPr>
+      <w:r>
+        <w:rPr>
+          <w:rFonts w:ascii="Times New Roman" w:hAnsi="Times New Roman"/>
+          <w:b/>
+          <w:sz w:val="24"/>
+        </w:rPr>
+        <w:t xml:space="preserve">1-jadval. Jahon mamlakatlarida agrar munosabatlar modellarining qiyosiy tavsifi</w:t>
+      </w:r>
+    </w:p>
+    <w:p>
+      <w:pPr>
+        <w:pStyle w:val="style0"/>
+        <w:spacing w:after="0" w:lineRule="auto" w:line="360" w:before="0"/>
+        <w:ind w:firstLine="720"/>
+        <w:jc w:val="both"/>
+        <w:rPr/>
+      </w:pPr>
+      <w:r>
+        <w:rPr>
+          <w:rFonts w:ascii="Times New Roman" w:hAnsi="Times New Roman"/>
+          <w:sz w:val="28"/>
+        </w:rPr>
+        <w:t xml:space="preserve">Ushbu jadvalda jahonning yetakchi agrar modellari yerga egalik shakli, asosiy xo'jalik yurituvchi sub'ektlar va O'zbekiston uchun ahamiyati nuqtai nazaridan qiyoslangan. Jadvaldan ko'rinib turibdiki, AQShda xususiy mulk va yirik agrobiznes, Yevropa Ittifoqida oilaviy fermer xo'jaliklari va kooperativlar, Xitoyda yerdan foydalanish huquqini uy xo'jaliklariga berish, Isroilda esa davlat yerini ijaraga berish va kooperatsiya yetakchi o'rin tutadi. Har bir modelning o'ziga xos afzalliklari mavjud bo'lib, O'zbekiston uchun ularning har biridan milliy sharoitga mos jihatlarni, xususan, kooperatsiya, davlat tomonidan qo'llab-quvvatlash va suv tejovchi texnologiyalar tajribasini tanlab olish maqsadga muvofiqdir.</w:t>
+      </w:r>
+    </w:p>
     <w:p>
       <w:pPr>
         <w:pStyle w:val="style0"/>
@@ -1113,7 +1620,7 @@
       <w:r>
         <w:rPr>
           <w:rFonts w:ascii="Times New Roman" w:hAnsi="Times New Roman"/>
-          <w:i/>
+          <w:b/>
           <w:sz w:val="24"/>
         </w:rPr>
         <w:t>1-rasm. O'zbekistonda agrar munosabatlarning nazariy-konseptual asoslari va jahon tajribasidagi o'rni</w:t>
@@ -1197,6 +1704,513 @@
           <w:vertAlign w:val="superscript"/>
         </w:rPr>
         <w:footnoteReference w:id="11"/>
+      </w:r>
+    </w:p>
+    <w:tbl>
+      <w:tblPr>
+        <w:tblStyle w:val="style154"/>
+        <w:tblW w:w="5000" w:type="pct"/>
+        <w:jc w:val="center"/>
+        <w:tblLook w:val="04A0" w:firstRow="1" w:lastRow="0" w:firstColumn="1" w:lastColumn="0" w:noHBand="0" w:noVBand="1"/>
+      </w:tblPr>
+      <w:tblGrid>
+        <w:gridCol w:w="2423"/>
+        <w:gridCol w:w="2423"/>
+        <w:gridCol w:w="2423"/>
+        <w:gridCol w:w="2423"/>
+      </w:tblGrid>
+      <w:tr>
+        <w:trPr>
+          <w:jc w:val="center"/>
+        </w:trPr>
+        <w:tc>
+          <w:tcPr>
+            <w:tcW w:w="2423" w:type="dxa"/>
+            <w:tcBorders/>
+            <w:shd w:val="clear" w:color="auto" w:fill="d6e4f0"/>
+          </w:tcPr>
+          <w:p>
+            <w:pPr>
+              <w:pStyle w:val="style0"/>
+              <w:spacing w:before="0" w:after="0"/>
+              <w:jc w:val="center"/>
+              <w:rPr/>
+            </w:pPr>
+            <w:r>
+              <w:rPr>
+                <w:rFonts w:ascii="Times New Roman" w:hAnsi="Times New Roman"/>
+                <w:b/>
+                <w:sz w:val="22"/>
+              </w:rPr>
+              <w:t xml:space="preserve">Sub'ekt</w:t>
+            </w:r>
+          </w:p>
+        </w:tc>
+        <w:tc>
+          <w:tcPr>
+            <w:tcW w:w="2423" w:type="dxa"/>
+            <w:tcBorders/>
+            <w:shd w:val="clear" w:color="auto" w:fill="d6e4f0"/>
+          </w:tcPr>
+          <w:p>
+            <w:pPr>
+              <w:pStyle w:val="style0"/>
+              <w:spacing w:before="0" w:after="0"/>
+              <w:jc w:val="center"/>
+              <w:rPr/>
+            </w:pPr>
+            <w:r>
+              <w:rPr>
+                <w:rFonts w:ascii="Times New Roman" w:hAnsi="Times New Roman"/>
+                <w:b/>
+                <w:sz w:val="22"/>
+              </w:rPr>
+              <w:t xml:space="preserve">Yerga egalik asosi</w:t>
+            </w:r>
+          </w:p>
+        </w:tc>
+        <w:tc>
+          <w:tcPr>
+            <w:tcW w:w="2423" w:type="dxa"/>
+            <w:tcBorders/>
+            <w:shd w:val="clear" w:color="auto" w:fill="d6e4f0"/>
+          </w:tcPr>
+          <w:p>
+            <w:pPr>
+              <w:pStyle w:val="style0"/>
+              <w:spacing w:before="0" w:after="0"/>
+              <w:jc w:val="center"/>
+              <w:rPr/>
+            </w:pPr>
+            <w:r>
+              <w:rPr>
+                <w:rFonts w:ascii="Times New Roman" w:hAnsi="Times New Roman"/>
+                <w:b/>
+                <w:sz w:val="22"/>
+              </w:rPr>
+              <w:t xml:space="preserve">Asosiy faoliyat yo'nalishi</w:t>
+            </w:r>
+          </w:p>
+        </w:tc>
+        <w:tc>
+          <w:tcPr>
+            <w:tcW w:w="2423" w:type="dxa"/>
+            <w:tcBorders/>
+            <w:shd w:val="clear" w:color="auto" w:fill="d6e4f0"/>
+          </w:tcPr>
+          <w:p>
+            <w:pPr>
+              <w:pStyle w:val="style0"/>
+              <w:spacing w:before="0" w:after="0"/>
+              <w:jc w:val="center"/>
+              <w:rPr/>
+            </w:pPr>
+            <w:r>
+              <w:rPr>
+                <w:rFonts w:ascii="Times New Roman" w:hAnsi="Times New Roman"/>
+                <w:b/>
+                <w:sz w:val="22"/>
+              </w:rPr>
+              <w:t xml:space="preserve">Mavjud muammolar</w:t>
+            </w:r>
+          </w:p>
+        </w:tc>
+      </w:tr>
+      <w:tr>
+        <w:tblPrEx/>
+        <w:trPr>
+          <w:jc w:val="center"/>
+        </w:trPr>
+        <w:tc>
+          <w:tcPr>
+            <w:tcW w:w="2423" w:type="dxa"/>
+            <w:tcBorders/>
+          </w:tcPr>
+          <w:p>
+            <w:pPr>
+              <w:pStyle w:val="style0"/>
+              <w:spacing w:before="0" w:after="0"/>
+              <w:jc w:val="center"/>
+              <w:rPr/>
+            </w:pPr>
+            <w:r>
+              <w:rPr>
+                <w:rFonts w:ascii="Times New Roman" w:hAnsi="Times New Roman"/>
+                <w:b/>
+                <w:sz w:val="22"/>
+              </w:rPr>
+              <w:t xml:space="preserve">Fermer xo'jaliklari</w:t>
+            </w:r>
+          </w:p>
+        </w:tc>
+        <w:tc>
+          <w:tcPr>
+            <w:tcW w:w="2423" w:type="dxa"/>
+            <w:tcBorders/>
+          </w:tcPr>
+          <w:p>
+            <w:pPr>
+              <w:pStyle w:val="style0"/>
+              <w:spacing w:before="0" w:after="0"/>
+              <w:jc w:val="center"/>
+              <w:rPr/>
+            </w:pPr>
+            <w:r>
+              <w:rPr>
+                <w:rFonts w:ascii="Times New Roman" w:hAnsi="Times New Roman"/>
+                <w:sz w:val="22"/>
+              </w:rPr>
+              <w:t xml:space="preserve">Uzoq muddatli ijara</w:t>
+            </w:r>
+          </w:p>
+        </w:tc>
+        <w:tc>
+          <w:tcPr>
+            <w:tcW w:w="2423" w:type="dxa"/>
+            <w:tcBorders/>
+          </w:tcPr>
+          <w:p>
+            <w:pPr>
+              <w:pStyle w:val="style0"/>
+              <w:spacing w:before="0" w:after="0"/>
+              <w:jc w:val="center"/>
+              <w:rPr/>
+            </w:pPr>
+            <w:r>
+              <w:rPr>
+                <w:rFonts w:ascii="Times New Roman" w:hAnsi="Times New Roman"/>
+                <w:sz w:val="22"/>
+              </w:rPr>
+              <w:t xml:space="preserve">Paxta, g'alla, bog'dorchilik, chorvachilik</w:t>
+            </w:r>
+          </w:p>
+        </w:tc>
+        <w:tc>
+          <w:tcPr>
+            <w:tcW w:w="2423" w:type="dxa"/>
+            <w:tcBorders/>
+          </w:tcPr>
+          <w:p>
+            <w:pPr>
+              <w:pStyle w:val="style0"/>
+              <w:spacing w:before="0" w:after="0"/>
+              <w:jc w:val="center"/>
+              <w:rPr/>
+            </w:pPr>
+            <w:r>
+              <w:rPr>
+                <w:rFonts w:ascii="Times New Roman" w:hAnsi="Times New Roman"/>
+                <w:sz w:val="22"/>
+              </w:rPr>
+              <w:t xml:space="preserve">Moliyaviy resurslar va texnika yetishmasligi</w:t>
+            </w:r>
+          </w:p>
+        </w:tc>
+      </w:tr>
+      <w:tr>
+        <w:tblPrEx/>
+        <w:trPr>
+          <w:jc w:val="center"/>
+        </w:trPr>
+        <w:tc>
+          <w:tcPr>
+            <w:tcW w:w="2423" w:type="dxa"/>
+            <w:tcBorders/>
+          </w:tcPr>
+          <w:p>
+            <w:pPr>
+              <w:pStyle w:val="style0"/>
+              <w:spacing w:before="0" w:after="0"/>
+              <w:jc w:val="center"/>
+              <w:rPr/>
+            </w:pPr>
+            <w:r>
+              <w:rPr>
+                <w:rFonts w:ascii="Times New Roman" w:hAnsi="Times New Roman"/>
+                <w:b/>
+                <w:sz w:val="22"/>
+              </w:rPr>
+              <w:t xml:space="preserve">Dehqon xo'jaliklari</w:t>
+            </w:r>
+          </w:p>
+        </w:tc>
+        <w:tc>
+          <w:tcPr>
+            <w:tcW w:w="2423" w:type="dxa"/>
+            <w:tcBorders/>
+          </w:tcPr>
+          <w:p>
+            <w:pPr>
+              <w:pStyle w:val="style0"/>
+              <w:spacing w:before="0" w:after="0"/>
+              <w:jc w:val="center"/>
+              <w:rPr/>
+            </w:pPr>
+            <w:r>
+              <w:rPr>
+                <w:rFonts w:ascii="Times New Roman" w:hAnsi="Times New Roman"/>
+                <w:sz w:val="22"/>
+              </w:rPr>
+              <w:t xml:space="preserve">Umrbod meros qilib qoldiriladigan egalik</w:t>
+            </w:r>
+          </w:p>
+        </w:tc>
+        <w:tc>
+          <w:tcPr>
+            <w:tcW w:w="2423" w:type="dxa"/>
+            <w:tcBorders/>
+          </w:tcPr>
+          <w:p>
+            <w:pPr>
+              <w:pStyle w:val="style0"/>
+              <w:spacing w:before="0" w:after="0"/>
+              <w:jc w:val="center"/>
+              <w:rPr/>
+            </w:pPr>
+            <w:r>
+              <w:rPr>
+                <w:rFonts w:ascii="Times New Roman" w:hAnsi="Times New Roman"/>
+                <w:sz w:val="22"/>
+              </w:rPr>
+              <w:t xml:space="preserve">Meva-sabzavot, chorva mahsulotlari yetishtirish</w:t>
+            </w:r>
+          </w:p>
+        </w:tc>
+        <w:tc>
+          <w:tcPr>
+            <w:tcW w:w="2423" w:type="dxa"/>
+            <w:tcBorders/>
+          </w:tcPr>
+          <w:p>
+            <w:pPr>
+              <w:pStyle w:val="style0"/>
+              <w:spacing w:before="0" w:after="0"/>
+              <w:jc w:val="center"/>
+              <w:rPr/>
+            </w:pPr>
+            <w:r>
+              <w:rPr>
+                <w:rFonts w:ascii="Times New Roman" w:hAnsi="Times New Roman"/>
+                <w:sz w:val="22"/>
+              </w:rPr>
+              <w:t xml:space="preserve">Kichik yer maydoni, bozorga chiqish imkoniyati cheklanganligi</w:t>
+            </w:r>
+          </w:p>
+        </w:tc>
+      </w:tr>
+      <w:tr>
+        <w:tblPrEx/>
+        <w:trPr>
+          <w:jc w:val="center"/>
+        </w:trPr>
+        <w:tc>
+          <w:tcPr>
+            <w:tcW w:w="2423" w:type="dxa"/>
+            <w:tcBorders/>
+          </w:tcPr>
+          <w:p>
+            <w:pPr>
+              <w:pStyle w:val="style0"/>
+              <w:spacing w:before="0" w:after="0"/>
+              <w:jc w:val="center"/>
+              <w:rPr/>
+            </w:pPr>
+            <w:r>
+              <w:rPr>
+                <w:rFonts w:ascii="Times New Roman" w:hAnsi="Times New Roman"/>
+                <w:b/>
+                <w:sz w:val="22"/>
+              </w:rPr>
+              <w:t xml:space="preserve">Paxta-to'qimachilik va boshqa klasterlar</w:t>
+            </w:r>
+          </w:p>
+        </w:tc>
+        <w:tc>
+          <w:tcPr>
+            <w:tcW w:w="2423" w:type="dxa"/>
+            <w:tcBorders/>
+          </w:tcPr>
+          <w:p>
+            <w:pPr>
+              <w:pStyle w:val="style0"/>
+              <w:spacing w:before="0" w:after="0"/>
+              <w:jc w:val="center"/>
+              <w:rPr/>
+            </w:pPr>
+            <w:r>
+              <w:rPr>
+                <w:rFonts w:ascii="Times New Roman" w:hAnsi="Times New Roman"/>
+                <w:sz w:val="22"/>
+              </w:rPr>
+              <w:t xml:space="preserve">Ijara va shartnoma asosida</w:t>
+            </w:r>
+          </w:p>
+        </w:tc>
+        <w:tc>
+          <w:tcPr>
+            <w:tcW w:w="2423" w:type="dxa"/>
+            <w:tcBorders/>
+          </w:tcPr>
+          <w:p>
+            <w:pPr>
+              <w:pStyle w:val="style0"/>
+              <w:spacing w:before="0" w:after="0"/>
+              <w:jc w:val="center"/>
+              <w:rPr/>
+            </w:pPr>
+            <w:r>
+              <w:rPr>
+                <w:rFonts w:ascii="Times New Roman" w:hAnsi="Times New Roman"/>
+                <w:sz w:val="22"/>
+              </w:rPr>
+              <w:t xml:space="preserve">Yetishtirish, qayta ishlash va eksportni birlashtirish</w:t>
+            </w:r>
+          </w:p>
+        </w:tc>
+        <w:tc>
+          <w:tcPr>
+            <w:tcW w:w="2423" w:type="dxa"/>
+            <w:tcBorders/>
+          </w:tcPr>
+          <w:p>
+            <w:pPr>
+              <w:pStyle w:val="style0"/>
+              <w:spacing w:before="0" w:after="0"/>
+              <w:jc w:val="center"/>
+              <w:rPr/>
+            </w:pPr>
+            <w:r>
+              <w:rPr>
+                <w:rFonts w:ascii="Times New Roman" w:hAnsi="Times New Roman"/>
+                <w:sz w:val="22"/>
+              </w:rPr>
+              <w:t xml:space="preserve">Fermerlar bilan shartnomaviy munosabatlarda muvozanat yo'qligi</w:t>
+            </w:r>
+          </w:p>
+        </w:tc>
+      </w:tr>
+      <w:tr>
+        <w:tblPrEx/>
+        <w:trPr>
+          <w:jc w:val="center"/>
+        </w:trPr>
+        <w:tc>
+          <w:tcPr>
+            <w:tcW w:w="2423" w:type="dxa"/>
+            <w:tcBorders/>
+          </w:tcPr>
+          <w:p>
+            <w:pPr>
+              <w:pStyle w:val="style0"/>
+              <w:spacing w:before="0" w:after="0"/>
+              <w:jc w:val="center"/>
+              <w:rPr/>
+            </w:pPr>
+            <w:r>
+              <w:rPr>
+                <w:rFonts w:ascii="Times New Roman" w:hAnsi="Times New Roman"/>
+                <w:b/>
+                <w:sz w:val="22"/>
+              </w:rPr>
+              <w:t xml:space="preserve">Qishloq xo'jaligi kooperativlari</w:t>
+            </w:r>
+          </w:p>
+        </w:tc>
+        <w:tc>
+          <w:tcPr>
+            <w:tcW w:w="2423" w:type="dxa"/>
+            <w:tcBorders/>
+          </w:tcPr>
+          <w:p>
+            <w:pPr>
+              <w:pStyle w:val="style0"/>
+              <w:spacing w:before="0" w:after="0"/>
+              <w:jc w:val="center"/>
+              <w:rPr/>
+            </w:pPr>
+            <w:r>
+              <w:rPr>
+                <w:rFonts w:ascii="Times New Roman" w:hAnsi="Times New Roman"/>
+                <w:sz w:val="22"/>
+              </w:rPr>
+              <w:t xml:space="preserve">A'zolarning ulushi va ijara</w:t>
+            </w:r>
+          </w:p>
+        </w:tc>
+        <w:tc>
+          <w:tcPr>
+            <w:tcW w:w="2423" w:type="dxa"/>
+            <w:tcBorders/>
+          </w:tcPr>
+          <w:p>
+            <w:pPr>
+              <w:pStyle w:val="style0"/>
+              <w:spacing w:before="0" w:after="0"/>
+              <w:jc w:val="center"/>
+              <w:rPr/>
+            </w:pPr>
+            <w:r>
+              <w:rPr>
+                <w:rFonts w:ascii="Times New Roman" w:hAnsi="Times New Roman"/>
+                <w:sz w:val="22"/>
+              </w:rPr>
+              <w:t xml:space="preserve">Texnika, xizmat va sotuvni birgalikda tashkil etish</w:t>
+            </w:r>
+          </w:p>
+        </w:tc>
+        <w:tc>
+          <w:tcPr>
+            <w:tcW w:w="2423" w:type="dxa"/>
+            <w:tcBorders/>
+          </w:tcPr>
+          <w:p>
+            <w:pPr>
+              <w:pStyle w:val="style0"/>
+              <w:spacing w:before="0" w:after="0"/>
+              <w:jc w:val="center"/>
+              <w:rPr/>
+            </w:pPr>
+            <w:r>
+              <w:rPr>
+                <w:rFonts w:ascii="Times New Roman" w:hAnsi="Times New Roman"/>
+                <w:sz w:val="22"/>
+              </w:rPr>
+              <w:t xml:space="preserve">Huquqiy baza va tajribaning yetarli emasligi</w:t>
+            </w:r>
+          </w:p>
+        </w:tc>
+      </w:tr>
+    </w:tbl>
+    <w:p>
+      <w:pPr>
+        <w:pStyle w:val="style0"/>
+        <w:spacing w:before="0" w:after="0"/>
+        <w:jc w:val="center"/>
+        <w:rPr/>
+      </w:pPr>
+      <w:r>
+        <w:rPr>
+          <w:rFonts w:ascii="Times New Roman" w:hAnsi="Times New Roman"/>
+          <w:b/>
+          <w:sz w:val="24"/>
+        </w:rPr>
+        <w:t xml:space="preserve">2-jadval. O'zbekistonda qishloq xo'jaligida faoliyat yurituvchi asosiy sub'ektlar tavsifi</w:t>
+      </w:r>
+    </w:p>
+    <w:p>
+      <w:pPr>
+        <w:pStyle w:val="style0"/>
+        <w:spacing w:after="0" w:lineRule="auto" w:line="360" w:before="0"/>
+        <w:ind w:firstLine="720"/>
+        <w:jc w:val="both"/>
+        <w:rPr/>
+      </w:pPr>
+      <w:r>
+        <w:rPr>
+          <w:rFonts w:ascii="Times New Roman" w:hAnsi="Times New Roman"/>
+          <w:sz w:val="28"/>
+        </w:rPr>
+        <w:t xml:space="preserve">Jadvalda O'zbekiston qishloq xo'jaligida faoliyat yurituvchi asosiy sub'ektlar - fermer va dehqon xo'jaliklari, klasterlar hamda kooperativlarning yerga egalik asosi, faoliyat yo'nalishi va duch kelayotgan muammolari keltirilgan. Unga ko'ra, fermer xo'jaliklari asosan ijara asosida yirik ekin maydonlarida faoliyat yuritsa, dehqon xo'jaliklari kichik maydonlarda aholining oziq-ovqat ehtiyojini qondirishda muhim o'rin tutadi. Klasterlar ishlab chiqarish, qayta ishlash va eksportni yagona zanjirga birlashtirgan bo'lsa-da, fermerlar bilan munosabatlarda muvozanatni ta'minlash talab etiladi. Kooperativlar esa endi shakllanish bosqichida bo'lib, ularni rivojlantirish uchun huquqiy va tashkiliy shart-sharoitlarni takomillashtirish zarur.</w:t>
       </w:r>
     </w:p>
     <w:p>
@@ -1396,7 +2410,7 @@
       <w:r>
         <w:rPr>
           <w:rFonts w:ascii="Times New Roman" w:hAnsi="Times New Roman"/>
-          <w:i/>
+          <w:b/>
           <w:sz w:val="24"/>
         </w:rPr>
         <w:t>2-rasm. O'zbekistonda qishloq xo'jaligi mahsulotlari ishlab chiqarish hajmining yillik o'sish sur'ati</w:t>
@@ -1796,7 +2810,7 @@
           <w:b/>
           <w:sz w:val="24"/>
         </w:rPr>
-        <w:t>1-jadval. O'zbekistonda agrar munosabatlarning bugungi holati</w:t>
+        <w:t xml:space="preserve">3-jadval. O'zbekistonda agrar munosabatlarning bugungi holati</w:t>
       </w:r>
     </w:p>
     <w:p>
@@ -1877,6 +2891,513 @@
           <w:vertAlign w:val="superscript"/>
         </w:rPr>
         <w:footnoteReference w:id="19"/>
+      </w:r>
+    </w:p>
+    <w:tbl>
+      <w:tblPr>
+        <w:tblStyle w:val="style154"/>
+        <w:tblW w:w="5000" w:type="pct"/>
+        <w:jc w:val="center"/>
+        <w:tblLook w:val="04A0" w:firstRow="1" w:lastRow="0" w:firstColumn="1" w:lastColumn="0" w:noHBand="0" w:noVBand="1"/>
+      </w:tblPr>
+      <w:tblGrid>
+        <w:gridCol w:w="2423"/>
+        <w:gridCol w:w="2423"/>
+        <w:gridCol w:w="2423"/>
+        <w:gridCol w:w="2423"/>
+      </w:tblGrid>
+      <w:tr>
+        <w:trPr>
+          <w:jc w:val="center"/>
+        </w:trPr>
+        <w:tc>
+          <w:tcPr>
+            <w:tcW w:w="2423" w:type="dxa"/>
+            <w:tcBorders/>
+            <w:shd w:val="clear" w:color="auto" w:fill="d6e4f0"/>
+          </w:tcPr>
+          <w:p>
+            <w:pPr>
+              <w:pStyle w:val="style0"/>
+              <w:spacing w:before="0" w:after="0"/>
+              <w:jc w:val="center"/>
+              <w:rPr/>
+            </w:pPr>
+            <w:r>
+              <w:rPr>
+                <w:rFonts w:ascii="Times New Roman" w:hAnsi="Times New Roman"/>
+                <w:b/>
+                <w:sz w:val="22"/>
+              </w:rPr>
+              <w:t xml:space="preserve">Hujjat nomi</w:t>
+            </w:r>
+          </w:p>
+        </w:tc>
+        <w:tc>
+          <w:tcPr>
+            <w:tcW w:w="2423" w:type="dxa"/>
+            <w:tcBorders/>
+            <w:shd w:val="clear" w:color="auto" w:fill="d6e4f0"/>
+          </w:tcPr>
+          <w:p>
+            <w:pPr>
+              <w:pStyle w:val="style0"/>
+              <w:spacing w:before="0" w:after="0"/>
+              <w:jc w:val="center"/>
+              <w:rPr/>
+            </w:pPr>
+            <w:r>
+              <w:rPr>
+                <w:rFonts w:ascii="Times New Roman" w:hAnsi="Times New Roman"/>
+                <w:b/>
+                <w:sz w:val="22"/>
+              </w:rPr>
+              <w:t xml:space="preserve">Qabul qilingan yili</w:t>
+            </w:r>
+          </w:p>
+        </w:tc>
+        <w:tc>
+          <w:tcPr>
+            <w:tcW w:w="2423" w:type="dxa"/>
+            <w:tcBorders/>
+            <w:shd w:val="clear" w:color="auto" w:fill="d6e4f0"/>
+          </w:tcPr>
+          <w:p>
+            <w:pPr>
+              <w:pStyle w:val="style0"/>
+              <w:spacing w:before="0" w:after="0"/>
+              <w:jc w:val="center"/>
+              <w:rPr/>
+            </w:pPr>
+            <w:r>
+              <w:rPr>
+                <w:rFonts w:ascii="Times New Roman" w:hAnsi="Times New Roman"/>
+                <w:b/>
+                <w:sz w:val="22"/>
+              </w:rPr>
+              <w:t xml:space="preserve">Tartibga soladigan soha</w:t>
+            </w:r>
+          </w:p>
+        </w:tc>
+        <w:tc>
+          <w:tcPr>
+            <w:tcW w:w="2423" w:type="dxa"/>
+            <w:tcBorders/>
+            <w:shd w:val="clear" w:color="auto" w:fill="d6e4f0"/>
+          </w:tcPr>
+          <w:p>
+            <w:pPr>
+              <w:pStyle w:val="style0"/>
+              <w:spacing w:before="0" w:after="0"/>
+              <w:jc w:val="center"/>
+              <w:rPr/>
+            </w:pPr>
+            <w:r>
+              <w:rPr>
+                <w:rFonts w:ascii="Times New Roman" w:hAnsi="Times New Roman"/>
+                <w:b/>
+                <w:sz w:val="22"/>
+              </w:rPr>
+              <w:t xml:space="preserve">Ahamiyati</w:t>
+            </w:r>
+          </w:p>
+        </w:tc>
+      </w:tr>
+      <w:tr>
+        <w:tblPrEx/>
+        <w:trPr>
+          <w:jc w:val="center"/>
+        </w:trPr>
+        <w:tc>
+          <w:tcPr>
+            <w:tcW w:w="2423" w:type="dxa"/>
+            <w:tcBorders/>
+          </w:tcPr>
+          <w:p>
+            <w:pPr>
+              <w:pStyle w:val="style0"/>
+              <w:spacing w:before="0" w:after="0"/>
+              <w:jc w:val="center"/>
+              <w:rPr/>
+            </w:pPr>
+            <w:r>
+              <w:rPr>
+                <w:rFonts w:ascii="Times New Roman" w:hAnsi="Times New Roman"/>
+                <w:b/>
+                <w:sz w:val="22"/>
+              </w:rPr>
+              <w:t xml:space="preserve">O'zbekiston Respublikasining Yer kodeksi</w:t>
+            </w:r>
+          </w:p>
+        </w:tc>
+        <w:tc>
+          <w:tcPr>
+            <w:tcW w:w="2423" w:type="dxa"/>
+            <w:tcBorders/>
+          </w:tcPr>
+          <w:p>
+            <w:pPr>
+              <w:pStyle w:val="style0"/>
+              <w:spacing w:before="0" w:after="0"/>
+              <w:jc w:val="center"/>
+              <w:rPr/>
+            </w:pPr>
+            <w:r>
+              <w:rPr>
+                <w:rFonts w:ascii="Times New Roman" w:hAnsi="Times New Roman"/>
+                <w:sz w:val="22"/>
+              </w:rPr>
+              <w:t xml:space="preserve">1998</w:t>
+            </w:r>
+          </w:p>
+        </w:tc>
+        <w:tc>
+          <w:tcPr>
+            <w:tcW w:w="2423" w:type="dxa"/>
+            <w:tcBorders/>
+          </w:tcPr>
+          <w:p>
+            <w:pPr>
+              <w:pStyle w:val="style0"/>
+              <w:spacing w:before="0" w:after="0"/>
+              <w:jc w:val="center"/>
+              <w:rPr/>
+            </w:pPr>
+            <w:r>
+              <w:rPr>
+                <w:rFonts w:ascii="Times New Roman" w:hAnsi="Times New Roman"/>
+                <w:sz w:val="22"/>
+              </w:rPr>
+              <w:t xml:space="preserve">Yerga egalik qilish, undan foydalanish va ijaraga berish</w:t>
+            </w:r>
+          </w:p>
+        </w:tc>
+        <w:tc>
+          <w:tcPr>
+            <w:tcW w:w="2423" w:type="dxa"/>
+            <w:tcBorders/>
+          </w:tcPr>
+          <w:p>
+            <w:pPr>
+              <w:pStyle w:val="style0"/>
+              <w:spacing w:before="0" w:after="0"/>
+              <w:jc w:val="center"/>
+              <w:rPr/>
+            </w:pPr>
+            <w:r>
+              <w:rPr>
+                <w:rFonts w:ascii="Times New Roman" w:hAnsi="Times New Roman"/>
+                <w:sz w:val="22"/>
+              </w:rPr>
+              <w:t xml:space="preserve">Yer munosabatlarining huquqiy asosini belgilaydi</w:t>
+            </w:r>
+          </w:p>
+        </w:tc>
+      </w:tr>
+      <w:tr>
+        <w:tblPrEx/>
+        <w:trPr>
+          <w:jc w:val="center"/>
+        </w:trPr>
+        <w:tc>
+          <w:tcPr>
+            <w:tcW w:w="2423" w:type="dxa"/>
+            <w:tcBorders/>
+          </w:tcPr>
+          <w:p>
+            <w:pPr>
+              <w:pStyle w:val="style0"/>
+              <w:spacing w:before="0" w:after="0"/>
+              <w:jc w:val="center"/>
+              <w:rPr/>
+            </w:pPr>
+            <w:r>
+              <w:rPr>
+                <w:rFonts w:ascii="Times New Roman" w:hAnsi="Times New Roman"/>
+                <w:b/>
+                <w:sz w:val="22"/>
+              </w:rPr>
+              <w:t xml:space="preserve">"Fermer xo'jaligi to'g'risida"gi Qonun</w:t>
+            </w:r>
+          </w:p>
+        </w:tc>
+        <w:tc>
+          <w:tcPr>
+            <w:tcW w:w="2423" w:type="dxa"/>
+            <w:tcBorders/>
+          </w:tcPr>
+          <w:p>
+            <w:pPr>
+              <w:pStyle w:val="style0"/>
+              <w:spacing w:before="0" w:after="0"/>
+              <w:jc w:val="center"/>
+              <w:rPr/>
+            </w:pPr>
+            <w:r>
+              <w:rPr>
+                <w:rFonts w:ascii="Times New Roman" w:hAnsi="Times New Roman"/>
+                <w:sz w:val="22"/>
+              </w:rPr>
+              <w:t xml:space="preserve">1998 (yangi tahriri 2004)</w:t>
+            </w:r>
+          </w:p>
+        </w:tc>
+        <w:tc>
+          <w:tcPr>
+            <w:tcW w:w="2423" w:type="dxa"/>
+            <w:tcBorders/>
+          </w:tcPr>
+          <w:p>
+            <w:pPr>
+              <w:pStyle w:val="style0"/>
+              <w:spacing w:before="0" w:after="0"/>
+              <w:jc w:val="center"/>
+              <w:rPr/>
+            </w:pPr>
+            <w:r>
+              <w:rPr>
+                <w:rFonts w:ascii="Times New Roman" w:hAnsi="Times New Roman"/>
+                <w:sz w:val="22"/>
+              </w:rPr>
+              <w:t xml:space="preserve">Fermer xo'jaliklarini tashkil etish va faoliyati</w:t>
+            </w:r>
+          </w:p>
+        </w:tc>
+        <w:tc>
+          <w:tcPr>
+            <w:tcW w:w="2423" w:type="dxa"/>
+            <w:tcBorders/>
+          </w:tcPr>
+          <w:p>
+            <w:pPr>
+              <w:pStyle w:val="style0"/>
+              <w:spacing w:before="0" w:after="0"/>
+              <w:jc w:val="center"/>
+              <w:rPr/>
+            </w:pPr>
+            <w:r>
+              <w:rPr>
+                <w:rFonts w:ascii="Times New Roman" w:hAnsi="Times New Roman"/>
+                <w:sz w:val="22"/>
+              </w:rPr>
+              <w:t xml:space="preserve">Fermerlarning huquq va majburiyatlarini mustahkamlaydi</w:t>
+            </w:r>
+          </w:p>
+        </w:tc>
+      </w:tr>
+      <w:tr>
+        <w:tblPrEx/>
+        <w:trPr>
+          <w:jc w:val="center"/>
+        </w:trPr>
+        <w:tc>
+          <w:tcPr>
+            <w:tcW w:w="2423" w:type="dxa"/>
+            <w:tcBorders/>
+          </w:tcPr>
+          <w:p>
+            <w:pPr>
+              <w:pStyle w:val="style0"/>
+              <w:spacing w:before="0" w:after="0"/>
+              <w:jc w:val="center"/>
+              <w:rPr/>
+            </w:pPr>
+            <w:r>
+              <w:rPr>
+                <w:rFonts w:ascii="Times New Roman" w:hAnsi="Times New Roman"/>
+                <w:b/>
+                <w:sz w:val="22"/>
+              </w:rPr>
+              <w:t xml:space="preserve">"Dehqon xo'jaligi to'g'risida"gi Qonun</w:t>
+            </w:r>
+          </w:p>
+        </w:tc>
+        <w:tc>
+          <w:tcPr>
+            <w:tcW w:w="2423" w:type="dxa"/>
+            <w:tcBorders/>
+          </w:tcPr>
+          <w:p>
+            <w:pPr>
+              <w:pStyle w:val="style0"/>
+              <w:spacing w:before="0" w:after="0"/>
+              <w:jc w:val="center"/>
+              <w:rPr/>
+            </w:pPr>
+            <w:r>
+              <w:rPr>
+                <w:rFonts w:ascii="Times New Roman" w:hAnsi="Times New Roman"/>
+                <w:sz w:val="22"/>
+              </w:rPr>
+              <w:t xml:space="preserve">1998</w:t>
+            </w:r>
+          </w:p>
+        </w:tc>
+        <w:tc>
+          <w:tcPr>
+            <w:tcW w:w="2423" w:type="dxa"/>
+            <w:tcBorders/>
+          </w:tcPr>
+          <w:p>
+            <w:pPr>
+              <w:pStyle w:val="style0"/>
+              <w:spacing w:before="0" w:after="0"/>
+              <w:jc w:val="center"/>
+              <w:rPr/>
+            </w:pPr>
+            <w:r>
+              <w:rPr>
+                <w:rFonts w:ascii="Times New Roman" w:hAnsi="Times New Roman"/>
+                <w:sz w:val="22"/>
+              </w:rPr>
+              <w:t xml:space="preserve">Dehqon xo'jaliklarining tashkil etilishi va faoliyati</w:t>
+            </w:r>
+          </w:p>
+        </w:tc>
+        <w:tc>
+          <w:tcPr>
+            <w:tcW w:w="2423" w:type="dxa"/>
+            <w:tcBorders/>
+          </w:tcPr>
+          <w:p>
+            <w:pPr>
+              <w:pStyle w:val="style0"/>
+              <w:spacing w:before="0" w:after="0"/>
+              <w:jc w:val="center"/>
+              <w:rPr/>
+            </w:pPr>
+            <w:r>
+              <w:rPr>
+                <w:rFonts w:ascii="Times New Roman" w:hAnsi="Times New Roman"/>
+                <w:sz w:val="22"/>
+              </w:rPr>
+              <w:t xml:space="preserve">Oilaviy tadbirkorlikni huquqiy himoya qiladi</w:t>
+            </w:r>
+          </w:p>
+        </w:tc>
+      </w:tr>
+      <w:tr>
+        <w:tblPrEx/>
+        <w:trPr>
+          <w:jc w:val="center"/>
+        </w:trPr>
+        <w:tc>
+          <w:tcPr>
+            <w:tcW w:w="2423" w:type="dxa"/>
+            <w:tcBorders/>
+          </w:tcPr>
+          <w:p>
+            <w:pPr>
+              <w:pStyle w:val="style0"/>
+              <w:spacing w:before="0" w:after="0"/>
+              <w:jc w:val="center"/>
+              <w:rPr/>
+            </w:pPr>
+            <w:r>
+              <w:rPr>
+                <w:rFonts w:ascii="Times New Roman" w:hAnsi="Times New Roman"/>
+                <w:b/>
+                <w:sz w:val="22"/>
+              </w:rPr>
+              <w:t xml:space="preserve">Qishloq xo'jaligini rivojlantirish strategiyasi (PF-5853)</w:t>
+            </w:r>
+          </w:p>
+        </w:tc>
+        <w:tc>
+          <w:tcPr>
+            <w:tcW w:w="2423" w:type="dxa"/>
+            <w:tcBorders/>
+          </w:tcPr>
+          <w:p>
+            <w:pPr>
+              <w:pStyle w:val="style0"/>
+              <w:spacing w:before="0" w:after="0"/>
+              <w:jc w:val="center"/>
+              <w:rPr/>
+            </w:pPr>
+            <w:r>
+              <w:rPr>
+                <w:rFonts w:ascii="Times New Roman" w:hAnsi="Times New Roman"/>
+                <w:sz w:val="22"/>
+              </w:rPr>
+              <w:t xml:space="preserve">2019</w:t>
+            </w:r>
+          </w:p>
+        </w:tc>
+        <w:tc>
+          <w:tcPr>
+            <w:tcW w:w="2423" w:type="dxa"/>
+            <w:tcBorders/>
+          </w:tcPr>
+          <w:p>
+            <w:pPr>
+              <w:pStyle w:val="style0"/>
+              <w:spacing w:before="0" w:after="0"/>
+              <w:jc w:val="center"/>
+              <w:rPr/>
+            </w:pPr>
+            <w:r>
+              <w:rPr>
+                <w:rFonts w:ascii="Times New Roman" w:hAnsi="Times New Roman"/>
+                <w:sz w:val="22"/>
+              </w:rPr>
+              <w:t xml:space="preserve">2020-2030-yillarda agrar sohani rivojlantirish</w:t>
+            </w:r>
+          </w:p>
+        </w:tc>
+        <w:tc>
+          <w:tcPr>
+            <w:tcW w:w="2423" w:type="dxa"/>
+            <w:tcBorders/>
+          </w:tcPr>
+          <w:p>
+            <w:pPr>
+              <w:pStyle w:val="style0"/>
+              <w:spacing w:before="0" w:after="0"/>
+              <w:jc w:val="center"/>
+              <w:rPr/>
+            </w:pPr>
+            <w:r>
+              <w:rPr>
+                <w:rFonts w:ascii="Times New Roman" w:hAnsi="Times New Roman"/>
+                <w:sz w:val="22"/>
+              </w:rPr>
+              <w:t xml:space="preserve">Islohotlarning ustuvor yo'nalishlarini belgilaydi</w:t>
+            </w:r>
+          </w:p>
+        </w:tc>
+      </w:tr>
+    </w:tbl>
+    <w:p>
+      <w:pPr>
+        <w:pStyle w:val="style0"/>
+        <w:spacing w:before="0" w:after="0"/>
+        <w:jc w:val="center"/>
+        <w:rPr/>
+      </w:pPr>
+      <w:r>
+        <w:rPr>
+          <w:rFonts w:ascii="Times New Roman" w:hAnsi="Times New Roman"/>
+          <w:b/>
+          <w:sz w:val="24"/>
+        </w:rPr>
+        <w:t xml:space="preserve">4-jadval. O'zbekistonda agrar munosabatlarni tartibga soluvchi asosiy normativ-huquqiy hujjatlar</w:t>
+      </w:r>
+    </w:p>
+    <w:p>
+      <w:pPr>
+        <w:pStyle w:val="style0"/>
+        <w:spacing w:after="0" w:lineRule="auto" w:line="360" w:before="0"/>
+        <w:ind w:firstLine="720"/>
+        <w:jc w:val="both"/>
+        <w:rPr/>
+      </w:pPr>
+      <w:r>
+        <w:rPr>
+          <w:rFonts w:ascii="Times New Roman" w:hAnsi="Times New Roman"/>
+          <w:sz w:val="28"/>
+        </w:rPr>
+        <w:t xml:space="preserve">Ushbu jadvalda O'zbekistonda agrar munosabatlarni tartibga soluvchi asosiy normativ-huquqiy hujjatlar, ularning qabul qilingan yili, tartibga soladigan sohasi va ahamiyati umumlashtirilgan. Yer kodeksi yer munosabatlarining umumiy huquqiy asosini belgilasa, fermer va dehqon xo'jaliklari to'g'risidagi qonunlar asosiy xo'jalik yurituvchi sub'ektlarning huquqiy maqomini mustahkamlaydi. 2020-2030-yillarga mo'ljallangan qishloq xo'jaligini rivojlantirish strategiyasi esa sohadagi islohotlarning uzoq muddatli ustuvor yo'nalishlarini belgilab beradi. Jadvaldan kelib chiqadigan xulosa shuki, agrar munosabatlarni takomillashtirish uchun mazkur huquqiy bazani zamonaviy talablar asosida muntazam yangilab borish zarur.</w:t>
       </w:r>
     </w:p>
     <w:p>
@@ -2417,7 +3938,7 @@
           <w:b/>
           <w:sz w:val="24"/>
         </w:rPr>
-        <w:t>2-jadval. O'zbekistonda agrar sohada fermer xo'jaliklariga ajratilgan yer maydonlari va ulardan foydalanish samaradorligi</w:t>
+        <w:t xml:space="preserve">5-jadval. O'zbekistonda agrar sohada fermer xo'jaliklariga ajratilgan yer maydonlari va ulardan foydalanish samaradorligi</w:t>
       </w:r>
     </w:p>
     <w:p>
@@ -2814,7 +4335,7 @@
           <w:b/>
           <w:sz w:val="24"/>
         </w:rPr>
-        <w:t>3-jadval. O'zbekistonda agrar munosabatlarni takomillashtirishning huquqiy-iqtisodiy mexanizmlari va zamonaviy yondashuvlari</w:t>
+        <w:t xml:space="preserve">6-jadval. O'zbekistonda agrar munosabatlarni takomillashtirishning huquqiy-iqtisodiy mexanizmlari va zamonaviy yondashuvlari</w:t>
       </w:r>
     </w:p>
     <w:p>
@@ -2895,6 +4416,513 @@
           <w:vertAlign w:val="superscript"/>
         </w:rPr>
         <w:footnoteReference w:id="27"/>
+      </w:r>
+    </w:p>
+    <w:tbl>
+      <w:tblPr>
+        <w:tblStyle w:val="style154"/>
+        <w:tblW w:w="5000" w:type="pct"/>
+        <w:jc w:val="center"/>
+        <w:tblLook w:val="04A0" w:firstRow="1" w:lastRow="0" w:firstColumn="1" w:lastColumn="0" w:noHBand="0" w:noVBand="1"/>
+      </w:tblPr>
+      <w:tblGrid>
+        <w:gridCol w:w="2423"/>
+        <w:gridCol w:w="2423"/>
+        <w:gridCol w:w="2423"/>
+        <w:gridCol w:w="2423"/>
+      </w:tblGrid>
+      <w:tr>
+        <w:trPr>
+          <w:jc w:val="center"/>
+        </w:trPr>
+        <w:tc>
+          <w:tcPr>
+            <w:tcW w:w="2423" w:type="dxa"/>
+            <w:tcBorders/>
+            <w:shd w:val="clear" w:color="auto" w:fill="d6e4f0"/>
+          </w:tcPr>
+          <w:p>
+            <w:pPr>
+              <w:pStyle w:val="style0"/>
+              <w:spacing w:before="0" w:after="0"/>
+              <w:jc w:val="center"/>
+              <w:rPr/>
+            </w:pPr>
+            <w:r>
+              <w:rPr>
+                <w:rFonts w:ascii="Times New Roman" w:hAnsi="Times New Roman"/>
+                <w:b/>
+                <w:sz w:val="22"/>
+              </w:rPr>
+              <w:t xml:space="preserve">Yo'nalish</w:t>
+            </w:r>
+          </w:p>
+        </w:tc>
+        <w:tc>
+          <w:tcPr>
+            <w:tcW w:w="2423" w:type="dxa"/>
+            <w:tcBorders/>
+            <w:shd w:val="clear" w:color="auto" w:fill="d6e4f0"/>
+          </w:tcPr>
+          <w:p>
+            <w:pPr>
+              <w:pStyle w:val="style0"/>
+              <w:spacing w:before="0" w:after="0"/>
+              <w:jc w:val="center"/>
+              <w:rPr/>
+            </w:pPr>
+            <w:r>
+              <w:rPr>
+                <w:rFonts w:ascii="Times New Roman" w:hAnsi="Times New Roman"/>
+                <w:b/>
+                <w:sz w:val="22"/>
+              </w:rPr>
+              <w:t xml:space="preserve">Asosiy chora-tadbirlar</w:t>
+            </w:r>
+          </w:p>
+        </w:tc>
+        <w:tc>
+          <w:tcPr>
+            <w:tcW w:w="2423" w:type="dxa"/>
+            <w:tcBorders/>
+            <w:shd w:val="clear" w:color="auto" w:fill="d6e4f0"/>
+          </w:tcPr>
+          <w:p>
+            <w:pPr>
+              <w:pStyle w:val="style0"/>
+              <w:spacing w:before="0" w:after="0"/>
+              <w:jc w:val="center"/>
+              <w:rPr/>
+            </w:pPr>
+            <w:r>
+              <w:rPr>
+                <w:rFonts w:ascii="Times New Roman" w:hAnsi="Times New Roman"/>
+                <w:b/>
+                <w:sz w:val="22"/>
+              </w:rPr>
+              <w:t xml:space="preserve">Kutilayotgan natija</w:t>
+            </w:r>
+          </w:p>
+        </w:tc>
+        <w:tc>
+          <w:tcPr>
+            <w:tcW w:w="2423" w:type="dxa"/>
+            <w:tcBorders/>
+            <w:shd w:val="clear" w:color="auto" w:fill="d6e4f0"/>
+          </w:tcPr>
+          <w:p>
+            <w:pPr>
+              <w:pStyle w:val="style0"/>
+              <w:spacing w:before="0" w:after="0"/>
+              <w:jc w:val="center"/>
+              <w:rPr/>
+            </w:pPr>
+            <w:r>
+              <w:rPr>
+                <w:rFonts w:ascii="Times New Roman" w:hAnsi="Times New Roman"/>
+                <w:b/>
+                <w:sz w:val="22"/>
+              </w:rPr>
+              <w:t xml:space="preserve">Amalga oshirish muddati</w:t>
+            </w:r>
+          </w:p>
+        </w:tc>
+      </w:tr>
+      <w:tr>
+        <w:tblPrEx/>
+        <w:trPr>
+          <w:jc w:val="center"/>
+        </w:trPr>
+        <w:tc>
+          <w:tcPr>
+            <w:tcW w:w="2423" w:type="dxa"/>
+            <w:tcBorders/>
+          </w:tcPr>
+          <w:p>
+            <w:pPr>
+              <w:pStyle w:val="style0"/>
+              <w:spacing w:before="0" w:after="0"/>
+              <w:jc w:val="center"/>
+              <w:rPr/>
+            </w:pPr>
+            <w:r>
+              <w:rPr>
+                <w:rFonts w:ascii="Times New Roman" w:hAnsi="Times New Roman"/>
+                <w:b/>
+                <w:sz w:val="22"/>
+              </w:rPr>
+              <w:t xml:space="preserve">Kooperatsiyani kengaytirish</w:t>
+            </w:r>
+          </w:p>
+        </w:tc>
+        <w:tc>
+          <w:tcPr>
+            <w:tcW w:w="2423" w:type="dxa"/>
+            <w:tcBorders/>
+          </w:tcPr>
+          <w:p>
+            <w:pPr>
+              <w:pStyle w:val="style0"/>
+              <w:spacing w:before="0" w:after="0"/>
+              <w:jc w:val="center"/>
+              <w:rPr/>
+            </w:pPr>
+            <w:r>
+              <w:rPr>
+                <w:rFonts w:ascii="Times New Roman" w:hAnsi="Times New Roman"/>
+                <w:sz w:val="22"/>
+              </w:rPr>
+              <w:t xml:space="preserve">Kooperativlar tashkil etishni soddalashtirish, soliq imtiyozlari berish</w:t>
+            </w:r>
+          </w:p>
+        </w:tc>
+        <w:tc>
+          <w:tcPr>
+            <w:tcW w:w="2423" w:type="dxa"/>
+            <w:tcBorders/>
+          </w:tcPr>
+          <w:p>
+            <w:pPr>
+              <w:pStyle w:val="style0"/>
+              <w:spacing w:before="0" w:after="0"/>
+              <w:jc w:val="center"/>
+              <w:rPr/>
+            </w:pPr>
+            <w:r>
+              <w:rPr>
+                <w:rFonts w:ascii="Times New Roman" w:hAnsi="Times New Roman"/>
+                <w:sz w:val="22"/>
+              </w:rPr>
+              <w:t xml:space="preserve">Kichik fermerlarning bozordagi raqobatbardoshligi oshishi</w:t>
+            </w:r>
+          </w:p>
+        </w:tc>
+        <w:tc>
+          <w:tcPr>
+            <w:tcW w:w="2423" w:type="dxa"/>
+            <w:tcBorders/>
+          </w:tcPr>
+          <w:p>
+            <w:pPr>
+              <w:pStyle w:val="style0"/>
+              <w:spacing w:before="0" w:after="0"/>
+              <w:jc w:val="center"/>
+              <w:rPr/>
+            </w:pPr>
+            <w:r>
+              <w:rPr>
+                <w:rFonts w:ascii="Times New Roman" w:hAnsi="Times New Roman"/>
+                <w:sz w:val="22"/>
+              </w:rPr>
+              <w:t xml:space="preserve">O'rta muddatli</w:t>
+            </w:r>
+          </w:p>
+        </w:tc>
+      </w:tr>
+      <w:tr>
+        <w:tblPrEx/>
+        <w:trPr>
+          <w:jc w:val="center"/>
+        </w:trPr>
+        <w:tc>
+          <w:tcPr>
+            <w:tcW w:w="2423" w:type="dxa"/>
+            <w:tcBorders/>
+          </w:tcPr>
+          <w:p>
+            <w:pPr>
+              <w:pStyle w:val="style0"/>
+              <w:spacing w:before="0" w:after="0"/>
+              <w:jc w:val="center"/>
+              <w:rPr/>
+            </w:pPr>
+            <w:r>
+              <w:rPr>
+                <w:rFonts w:ascii="Times New Roman" w:hAnsi="Times New Roman"/>
+                <w:b/>
+                <w:sz w:val="22"/>
+              </w:rPr>
+              <w:t xml:space="preserve">Raqamlashtirish</w:t>
+            </w:r>
+          </w:p>
+        </w:tc>
+        <w:tc>
+          <w:tcPr>
+            <w:tcW w:w="2423" w:type="dxa"/>
+            <w:tcBorders/>
+          </w:tcPr>
+          <w:p>
+            <w:pPr>
+              <w:pStyle w:val="style0"/>
+              <w:spacing w:before="0" w:after="0"/>
+              <w:jc w:val="center"/>
+              <w:rPr/>
+            </w:pPr>
+            <w:r>
+              <w:rPr>
+                <w:rFonts w:ascii="Times New Roman" w:hAnsi="Times New Roman"/>
+                <w:sz w:val="22"/>
+              </w:rPr>
+              <w:t xml:space="preserve">Elektron platformalar, yer va hosil monitoringi tizimlarini joriy etish</w:t>
+            </w:r>
+          </w:p>
+        </w:tc>
+        <w:tc>
+          <w:tcPr>
+            <w:tcW w:w="2423" w:type="dxa"/>
+            <w:tcBorders/>
+          </w:tcPr>
+          <w:p>
+            <w:pPr>
+              <w:pStyle w:val="style0"/>
+              <w:spacing w:before="0" w:after="0"/>
+              <w:jc w:val="center"/>
+              <w:rPr/>
+            </w:pPr>
+            <w:r>
+              <w:rPr>
+                <w:rFonts w:ascii="Times New Roman" w:hAnsi="Times New Roman"/>
+                <w:sz w:val="22"/>
+              </w:rPr>
+              <w:t xml:space="preserve">Resurslardan foydalanish samaradorligi oshishi</w:t>
+            </w:r>
+          </w:p>
+        </w:tc>
+        <w:tc>
+          <w:tcPr>
+            <w:tcW w:w="2423" w:type="dxa"/>
+            <w:tcBorders/>
+          </w:tcPr>
+          <w:p>
+            <w:pPr>
+              <w:pStyle w:val="style0"/>
+              <w:spacing w:before="0" w:after="0"/>
+              <w:jc w:val="center"/>
+              <w:rPr/>
+            </w:pPr>
+            <w:r>
+              <w:rPr>
+                <w:rFonts w:ascii="Times New Roman" w:hAnsi="Times New Roman"/>
+                <w:sz w:val="22"/>
+              </w:rPr>
+              <w:t xml:space="preserve">Qisqa va o'rta muddatli</w:t>
+            </w:r>
+          </w:p>
+        </w:tc>
+      </w:tr>
+      <w:tr>
+        <w:tblPrEx/>
+        <w:trPr>
+          <w:jc w:val="center"/>
+        </w:trPr>
+        <w:tc>
+          <w:tcPr>
+            <w:tcW w:w="2423" w:type="dxa"/>
+            <w:tcBorders/>
+          </w:tcPr>
+          <w:p>
+            <w:pPr>
+              <w:pStyle w:val="style0"/>
+              <w:spacing w:before="0" w:after="0"/>
+              <w:jc w:val="center"/>
+              <w:rPr/>
+            </w:pPr>
+            <w:r>
+              <w:rPr>
+                <w:rFonts w:ascii="Times New Roman" w:hAnsi="Times New Roman"/>
+                <w:b/>
+                <w:sz w:val="22"/>
+              </w:rPr>
+              <w:t xml:space="preserve">Moliyaviy qo'llab-quvvatlash</w:t>
+            </w:r>
+          </w:p>
+        </w:tc>
+        <w:tc>
+          <w:tcPr>
+            <w:tcW w:w="2423" w:type="dxa"/>
+            <w:tcBorders/>
+          </w:tcPr>
+          <w:p>
+            <w:pPr>
+              <w:pStyle w:val="style0"/>
+              <w:spacing w:before="0" w:after="0"/>
+              <w:jc w:val="center"/>
+              <w:rPr/>
+            </w:pPr>
+            <w:r>
+              <w:rPr>
+                <w:rFonts w:ascii="Times New Roman" w:hAnsi="Times New Roman"/>
+                <w:sz w:val="22"/>
+              </w:rPr>
+              <w:t xml:space="preserve">Imtiyozli kreditlar, lizing va sug'urta mexanizmlarini kengaytirish</w:t>
+            </w:r>
+          </w:p>
+        </w:tc>
+        <w:tc>
+          <w:tcPr>
+            <w:tcW w:w="2423" w:type="dxa"/>
+            <w:tcBorders/>
+          </w:tcPr>
+          <w:p>
+            <w:pPr>
+              <w:pStyle w:val="style0"/>
+              <w:spacing w:before="0" w:after="0"/>
+              <w:jc w:val="center"/>
+              <w:rPr/>
+            </w:pPr>
+            <w:r>
+              <w:rPr>
+                <w:rFonts w:ascii="Times New Roman" w:hAnsi="Times New Roman"/>
+                <w:sz w:val="22"/>
+              </w:rPr>
+              <w:t xml:space="preserve">Texnik jihozlanish darajasi oshishi</w:t>
+            </w:r>
+          </w:p>
+        </w:tc>
+        <w:tc>
+          <w:tcPr>
+            <w:tcW w:w="2423" w:type="dxa"/>
+            <w:tcBorders/>
+          </w:tcPr>
+          <w:p>
+            <w:pPr>
+              <w:pStyle w:val="style0"/>
+              <w:spacing w:before="0" w:after="0"/>
+              <w:jc w:val="center"/>
+              <w:rPr/>
+            </w:pPr>
+            <w:r>
+              <w:rPr>
+                <w:rFonts w:ascii="Times New Roman" w:hAnsi="Times New Roman"/>
+                <w:sz w:val="22"/>
+              </w:rPr>
+              <w:t xml:space="preserve">Qisqa muddatli</w:t>
+            </w:r>
+          </w:p>
+        </w:tc>
+      </w:tr>
+      <w:tr>
+        <w:tblPrEx/>
+        <w:trPr>
+          <w:jc w:val="center"/>
+        </w:trPr>
+        <w:tc>
+          <w:tcPr>
+            <w:tcW w:w="2423" w:type="dxa"/>
+            <w:tcBorders/>
+          </w:tcPr>
+          <w:p>
+            <w:pPr>
+              <w:pStyle w:val="style0"/>
+              <w:spacing w:before="0" w:after="0"/>
+              <w:jc w:val="center"/>
+              <w:rPr/>
+            </w:pPr>
+            <w:r>
+              <w:rPr>
+                <w:rFonts w:ascii="Times New Roman" w:hAnsi="Times New Roman"/>
+                <w:b/>
+                <w:sz w:val="22"/>
+              </w:rPr>
+              <w:t xml:space="preserve">Suv tejovchi texnologiyalar</w:t>
+            </w:r>
+          </w:p>
+        </w:tc>
+        <w:tc>
+          <w:tcPr>
+            <w:tcW w:w="2423" w:type="dxa"/>
+            <w:tcBorders/>
+          </w:tcPr>
+          <w:p>
+            <w:pPr>
+              <w:pStyle w:val="style0"/>
+              <w:spacing w:before="0" w:after="0"/>
+              <w:jc w:val="center"/>
+              <w:rPr/>
+            </w:pPr>
+            <w:r>
+              <w:rPr>
+                <w:rFonts w:ascii="Times New Roman" w:hAnsi="Times New Roman"/>
+                <w:sz w:val="22"/>
+              </w:rPr>
+              <w:t xml:space="preserve">Tomchilatib va yomg'irlatib sug'orishni subsidiyalash</w:t>
+            </w:r>
+          </w:p>
+        </w:tc>
+        <w:tc>
+          <w:tcPr>
+            <w:tcW w:w="2423" w:type="dxa"/>
+            <w:tcBorders/>
+          </w:tcPr>
+          <w:p>
+            <w:pPr>
+              <w:pStyle w:val="style0"/>
+              <w:spacing w:before="0" w:after="0"/>
+              <w:jc w:val="center"/>
+              <w:rPr/>
+            </w:pPr>
+            <w:r>
+              <w:rPr>
+                <w:rFonts w:ascii="Times New Roman" w:hAnsi="Times New Roman"/>
+                <w:sz w:val="22"/>
+              </w:rPr>
+              <w:t xml:space="preserve">Suv sarfi kamayishi va hosildorlik ortishi</w:t>
+            </w:r>
+          </w:p>
+        </w:tc>
+        <w:tc>
+          <w:tcPr>
+            <w:tcW w:w="2423" w:type="dxa"/>
+            <w:tcBorders/>
+          </w:tcPr>
+          <w:p>
+            <w:pPr>
+              <w:pStyle w:val="style0"/>
+              <w:spacing w:before="0" w:after="0"/>
+              <w:jc w:val="center"/>
+              <w:rPr/>
+            </w:pPr>
+            <w:r>
+              <w:rPr>
+                <w:rFonts w:ascii="Times New Roman" w:hAnsi="Times New Roman"/>
+                <w:sz w:val="22"/>
+              </w:rPr>
+              <w:t xml:space="preserve">Uzoq muddatli</w:t>
+            </w:r>
+          </w:p>
+        </w:tc>
+      </w:tr>
+    </w:tbl>
+    <w:p>
+      <w:pPr>
+        <w:pStyle w:val="style0"/>
+        <w:spacing w:before="0" w:after="0"/>
+        <w:jc w:val="center"/>
+        <w:rPr/>
+      </w:pPr>
+      <w:r>
+        <w:rPr>
+          <w:rFonts w:ascii="Times New Roman" w:hAnsi="Times New Roman"/>
+          <w:b/>
+          <w:sz w:val="24"/>
+        </w:rPr>
+        <w:t xml:space="preserve">7-jadval. Fermer xo'jaliklari va qishloq xo'jaligi kooperativlarini rivojlantirishning istiqbolli yo'nalishlari</w:t>
+      </w:r>
+    </w:p>
+    <w:p>
+      <w:pPr>
+        <w:pStyle w:val="style0"/>
+        <w:spacing w:after="0" w:lineRule="auto" w:line="360" w:before="0"/>
+        <w:ind w:firstLine="720"/>
+        <w:jc w:val="both"/>
+        <w:rPr/>
+      </w:pPr>
+      <w:r>
+        <w:rPr>
+          <w:rFonts w:ascii="Times New Roman" w:hAnsi="Times New Roman"/>
+          <w:sz w:val="28"/>
+        </w:rPr>
+        <w:t xml:space="preserve">Jadvalda fermer xo'jaliklari va qishloq xo'jaligi kooperativlarini rivojlantirishning istiqbolli yo'nalishlari, ular bo'yicha asosiy chora-tadbirlar, kutilayotgan natijalar va amalga oshirish muddatlari ko'rsatilgan. Unga ko'ra, kooperatsiyani kengaytirish kichik fermerlarning bozordagi o'rnini mustahkamlasa, raqamlashtirish va moliyaviy qo'llab-quvvatlash resurslardan samarali foydalanish hamda texnik jihozlanishni yaxshilashga xizmat qiladi. Suv tejovchi texnologiyalarni joriy etish esa suv tanqisligi sharoitida qishloq xo'jaligining barqaror rivojlanishini ta'minlovchi uzoq muddatli yo'nalish hisoblanadi. Mazkur yo'nalishlarning kompleks amalga oshirilishi agrar sohada samaradorlikni oshirish va qishloq aholisi daromadlarini ko'paytirish imkonini beradi.</w:t>
       </w:r>
     </w:p>
     <w:p>

</xml_diff>

<commit_message>
Agrar kurs ishi: nomlar jadval/rasm ustida, xulosa alohida varaqda, kirishga snoska
Co-Authored-By: Claude Opus 5.5 <noreply@anthropic.com>
Claude-Session: https://claude.ai/code/session_01SPUXgDHyaKJrV6o5CiPGr8
</commit_message>
<xml_diff>
--- a/kurs_ishi/kurs_ishi_tahrirlangan.docx
+++ b/kurs_ishi/kurs_ishi_tahrirlangan.docx
@@ -664,6 +664,29 @@
           <w:rFonts w:ascii="Times New Roman" w:hAnsi="Times New Roman"/>
           <w:sz w:val="28"/>
         </w:rPr>
+        <w:t xml:space="preserve">Prezident Sh.M.Mirziyoyev tomonidan Oʻzbekiston qishloq xoʻjaligini rivojlantirishning 2020–2030-yillarga moʻljallangan strategiyasining tasdiqlanishi agrar sohada bozor mexanizmlarini joriy etish, yer munosabatlarini isloh qilish va qishloq aholisi daromadlarini oshirishni ustuvor vazifa sifatida belgilab berdi.</w:t>
+      </w:r>
+      <w:r>
+        <w:rPr>
+          <w:rStyle w:val="FootnoteReference"/>
+          <w:vertAlign w:val="superscript"/>
+          <w:sz w:val="20"/>
+          <w:szCs w:val="20"/>
+        </w:rPr>
+        <w:footnoteReference w:id="34"/>
+      </w:r>
+      <w:r>
+        <w:rPr>
+          <w:rFonts w:ascii="Times New Roman" w:hAnsi="Times New Roman"/>
+          <w:sz w:val="28"/>
+        </w:rPr>
+        <w:t xml:space="preserve"> </w:t>
+      </w:r>
+      <w:r>
+        <w:rPr>
+          <w:rFonts w:ascii="Times New Roman" w:hAnsi="Times New Roman"/>
+          <w:sz w:val="28"/>
+        </w:rPr>
         <w:t>Oʻzbekiston iqtisodiyotining tayanchi boʻlgan qishloq xoʻjaligini rivojlantirish bugungi kunning eng dolzarb vazifalaridan biridir. Davlatimiz rahbari Shavkat Mirziyoyev taʼkidlaganlaridek, “Qishloq xoʻjaligi – bu faqat paxta va gʻalla emas, balki bogʻdorchilik, polizchilik, chorvachilik, baliqchilik, asalarichilik kabi koʻplab tarmoqlarni oʻz ichiga oladi. Shu bilan birga, bu soha nafaqat oziq-ovqat xavfsizligini taʼminlaydi, balki ming-minglab odamlarning bandligini va daromadini taʼminlovchi muhim manba hamdir. Biz bu imkoniyatlardan toʻliq foydalanishimiz lozim” (Sh.M. Mirziyoyev. Oliy Majlisga Murojaatnomasi. Oʻzbekiston Respublikasi Oliy Majlisi Qonunchilik palatasi va Senati, Toshkent, 2023 yil. [https://president.uz/uz/lists/view/6172]). Ushbu soʻzlar Oʻzbekistonda agrar sohani modernizatsiya qilish, uning raqobatbardoshligini oshirish va jahon bozoriga integratsiyalashuvini kuchaytirish zaruriyatini yana bir bor tasdiqlaydi.</w:t>
       </w:r>
       <w:r>
@@ -898,6 +921,23 @@
           <w:vertAlign w:val="superscript"/>
         </w:rPr>
         <w:footnoteReference w:id="3"/>
+      </w:r>
+    </w:p>
+    <w:p>
+      <w:pPr>
+        <w:pStyle w:val="style0"/>
+        <w:keepNext/>
+        <w:spacing w:before="0" w:after="0"/>
+        <w:jc w:val="center"/>
+        <w:rPr/>
+      </w:pPr>
+      <w:r>
+        <w:rPr>
+          <w:rFonts w:ascii="Times New Roman" w:hAnsi="Times New Roman"/>
+          <w:b/>
+          <w:sz w:val="24"/>
+        </w:rPr>
+        <w:t xml:space="preserve">1-jadval. Jahon mamlakatlarida agrar munosabatlar modellarining qiyosiy tavsifi</w:t>
       </w:r>
     </w:p>
     <w:tbl>
@@ -1378,22 +1418,6 @@
     <w:p>
       <w:pPr>
         <w:pStyle w:val="style0"/>
-        <w:spacing w:before="0" w:after="0"/>
-        <w:jc w:val="center"/>
-        <w:rPr/>
-      </w:pPr>
-      <w:r>
-        <w:rPr>
-          <w:rFonts w:ascii="Times New Roman" w:hAnsi="Times New Roman"/>
-          <w:b/>
-          <w:sz w:val="24"/>
-        </w:rPr>
-        <w:t xml:space="preserve">1-jadval. Jahon mamlakatlarida agrar munosabatlar modellarining qiyosiy tavsifi</w:t>
-      </w:r>
-    </w:p>
-    <w:p>
-      <w:pPr>
-        <w:pStyle w:val="style0"/>
         <w:spacing w:after="0" w:lineRule="auto" w:line="360" w:before="0"/>
         <w:ind w:firstLine="720"/>
         <w:jc w:val="both"/>
@@ -1565,6 +1589,23 @@
           <w:sz w:val="26"/>
         </w:rPr>
         <w:t>Bu tizimning asosiy qismlari va ularning o'zaro aloqadorligini quyidagi sxema aks ettiradi:</w:t>
+      </w:r>
+    </w:p>
+    <w:p>
+      <w:pPr>
+        <w:pStyle w:val="style0"/>
+        <w:keepNext/>
+        <w:spacing w:before="0" w:after="0"/>
+        <w:jc w:val="center"/>
+        <w:rPr/>
+      </w:pPr>
+      <w:r>
+        <w:rPr>
+          <w:rFonts w:ascii="Times New Roman" w:hAnsi="Times New Roman"/>
+          <w:b/>
+          <w:sz w:val="24"/>
+        </w:rPr>
+        <w:t>1-rasm. O'zbekistonda agrar munosabatlarning nazariy-konseptual asoslari va jahon tajribasidagi o'rni</w:t>
       </w:r>
     </w:p>
     <w:p>
@@ -1613,22 +1654,6 @@
     <w:p>
       <w:pPr>
         <w:pStyle w:val="style0"/>
-        <w:spacing w:before="0" w:after="0"/>
-        <w:jc w:val="center"/>
-        <w:rPr/>
-      </w:pPr>
-      <w:r>
-        <w:rPr>
-          <w:rFonts w:ascii="Times New Roman" w:hAnsi="Times New Roman"/>
-          <w:b/>
-          <w:sz w:val="24"/>
-        </w:rPr>
-        <w:t>1-rasm. O'zbekistonda agrar munosabatlarning nazariy-konseptual asoslari va jahon tajribasidagi o'rni</w:t>
-      </w:r>
-    </w:p>
-    <w:p>
-      <w:pPr>
-        <w:pStyle w:val="style0"/>
         <w:spacing w:after="0" w:lineRule="auto" w:line="360" w:before="0"/>
         <w:ind w:firstLine="720"/>
         <w:jc w:val="both"/>
@@ -1704,6 +1729,23 @@
           <w:vertAlign w:val="superscript"/>
         </w:rPr>
         <w:footnoteReference w:id="11"/>
+      </w:r>
+    </w:p>
+    <w:p>
+      <w:pPr>
+        <w:pStyle w:val="style0"/>
+        <w:keepNext/>
+        <w:spacing w:before="0" w:after="0"/>
+        <w:jc w:val="center"/>
+        <w:rPr/>
+      </w:pPr>
+      <w:r>
+        <w:rPr>
+          <w:rFonts w:ascii="Times New Roman" w:hAnsi="Times New Roman"/>
+          <w:b/>
+          <w:sz w:val="24"/>
+        </w:rPr>
+        <w:t xml:space="preserve">2-jadval. O'zbekistonda qishloq xo'jaligida faoliyat yurituvchi asosiy sub'ektlar tavsifi</w:t>
       </w:r>
     </w:p>
     <w:tbl>
@@ -2184,22 +2226,6 @@
     <w:p>
       <w:pPr>
         <w:pStyle w:val="style0"/>
-        <w:spacing w:before="0" w:after="0"/>
-        <w:jc w:val="center"/>
-        <w:rPr/>
-      </w:pPr>
-      <w:r>
-        <w:rPr>
-          <w:rFonts w:ascii="Times New Roman" w:hAnsi="Times New Roman"/>
-          <w:b/>
-          <w:sz w:val="24"/>
-        </w:rPr>
-        <w:t xml:space="preserve">2-jadval. O'zbekistonda qishloq xo'jaligida faoliyat yurituvchi asosiy sub'ektlar tavsifi</w:t>
-      </w:r>
-    </w:p>
-    <w:p>
-      <w:pPr>
-        <w:pStyle w:val="style0"/>
         <w:spacing w:after="0" w:lineRule="auto" w:line="360" w:before="0"/>
         <w:ind w:firstLine="720"/>
         <w:jc w:val="both"/>
@@ -2355,6 +2381,23 @@
           <w:vertAlign w:val="superscript"/>
         </w:rPr>
         <w:footnoteReference w:id="17"/>
+      </w:r>
+    </w:p>
+    <w:p>
+      <w:pPr>
+        <w:pStyle w:val="style0"/>
+        <w:keepNext/>
+        <w:spacing w:before="0" w:after="0"/>
+        <w:jc w:val="center"/>
+        <w:rPr/>
+      </w:pPr>
+      <w:r>
+        <w:rPr>
+          <w:rFonts w:ascii="Times New Roman" w:hAnsi="Times New Roman"/>
+          <w:b/>
+          <w:sz w:val="24"/>
+        </w:rPr>
+        <w:t>2-rasm. O'zbekistonda qishloq xo'jaligi mahsulotlari ishlab chiqarish hajmining yillik o'sish sur'ati</w:t>
       </w:r>
     </w:p>
     <w:p>
@@ -2403,22 +2446,6 @@
     <w:p>
       <w:pPr>
         <w:pStyle w:val="style0"/>
-        <w:spacing w:before="0" w:after="0"/>
-        <w:jc w:val="center"/>
-        <w:rPr/>
-      </w:pPr>
-      <w:r>
-        <w:rPr>
-          <w:rFonts w:ascii="Times New Roman" w:hAnsi="Times New Roman"/>
-          <w:b/>
-          <w:sz w:val="24"/>
-        </w:rPr>
-        <w:t>2-rasm. O'zbekistonda qishloq xo'jaligi mahsulotlari ishlab chiqarish hajmining yillik o'sish sur'ati</w:t>
-      </w:r>
-    </w:p>
-    <w:p>
-      <w:pPr>
-        <w:pStyle w:val="style0"/>
         <w:spacing w:after="0" w:lineRule="auto" w:line="360" w:before="0"/>
         <w:ind w:firstLine="720"/>
         <w:jc w:val="both"/>
@@ -2446,6 +2473,23 @@
           <w:sz w:val="26"/>
         </w:rPr>
         <w:t>Shu holatni yanada aniqroq tushunish uchun asosiy ko'rsatkichlarning qiyosiy tahlili:</w:t>
+      </w:r>
+    </w:p>
+    <w:p>
+      <w:pPr>
+        <w:pStyle w:val="style0"/>
+        <w:keepNext/>
+        <w:spacing w:before="0" w:after="0"/>
+        <w:jc w:val="center"/>
+        <w:rPr/>
+      </w:pPr>
+      <w:r>
+        <w:rPr>
+          <w:rFonts w:ascii="Times New Roman" w:hAnsi="Times New Roman"/>
+          <w:b/>
+          <w:sz w:val="24"/>
+        </w:rPr>
+        <w:t xml:space="preserve">3-jadval. O'zbekistonda agrar munosabatlarning bugungi holati</w:t>
       </w:r>
     </w:p>
     <w:tbl>
@@ -2800,22 +2844,6 @@
     <w:p>
       <w:pPr>
         <w:pStyle w:val="style0"/>
-        <w:spacing w:before="0" w:after="0"/>
-        <w:jc w:val="center"/>
-        <w:rPr/>
-      </w:pPr>
-      <w:r>
-        <w:rPr>
-          <w:rFonts w:ascii="Times New Roman" w:hAnsi="Times New Roman"/>
-          <w:b/>
-          <w:sz w:val="24"/>
-        </w:rPr>
-        <w:t xml:space="preserve">3-jadval. O'zbekistonda agrar munosabatlarning bugungi holati</w:t>
-      </w:r>
-    </w:p>
-    <w:p>
-      <w:pPr>
-        <w:pStyle w:val="style0"/>
         <w:spacing w:after="0" w:lineRule="auto" w:line="360" w:before="0"/>
         <w:ind w:firstLine="720"/>
         <w:jc w:val="both"/>
@@ -2891,6 +2919,23 @@
           <w:vertAlign w:val="superscript"/>
         </w:rPr>
         <w:footnoteReference w:id="19"/>
+      </w:r>
+    </w:p>
+    <w:p>
+      <w:pPr>
+        <w:pStyle w:val="style0"/>
+        <w:keepNext/>
+        <w:spacing w:before="0" w:after="0"/>
+        <w:jc w:val="center"/>
+        <w:rPr/>
+      </w:pPr>
+      <w:r>
+        <w:rPr>
+          <w:rFonts w:ascii="Times New Roman" w:hAnsi="Times New Roman"/>
+          <w:b/>
+          <w:sz w:val="24"/>
+        </w:rPr>
+        <w:t xml:space="preserve">4-jadval. O'zbekistonda agrar munosabatlarni tartibga soluvchi asosiy normativ-huquqiy hujjatlar</w:t>
       </w:r>
     </w:p>
     <w:tbl>
@@ -3371,22 +3416,6 @@
     <w:p>
       <w:pPr>
         <w:pStyle w:val="style0"/>
-        <w:spacing w:before="0" w:after="0"/>
-        <w:jc w:val="center"/>
-        <w:rPr/>
-      </w:pPr>
-      <w:r>
-        <w:rPr>
-          <w:rFonts w:ascii="Times New Roman" w:hAnsi="Times New Roman"/>
-          <w:b/>
-          <w:sz w:val="24"/>
-        </w:rPr>
-        <w:t xml:space="preserve">4-jadval. O'zbekistonda agrar munosabatlarni tartibga soluvchi asosiy normativ-huquqiy hujjatlar</w:t>
-      </w:r>
-    </w:p>
-    <w:p>
-      <w:pPr>
-        <w:pStyle w:val="style0"/>
         <w:spacing w:after="0" w:lineRule="auto" w:line="360" w:before="0"/>
         <w:ind w:firstLine="720"/>
         <w:jc w:val="both"/>
@@ -3542,6 +3571,23 @@
           <w:vertAlign w:val="superscript"/>
         </w:rPr>
         <w:footnoteReference w:id="25"/>
+      </w:r>
+    </w:p>
+    <w:p>
+      <w:pPr>
+        <w:pStyle w:val="style0"/>
+        <w:keepNext/>
+        <w:spacing w:before="0" w:after="0"/>
+        <w:jc w:val="center"/>
+        <w:rPr/>
+      </w:pPr>
+      <w:r>
+        <w:rPr>
+          <w:rFonts w:ascii="Times New Roman" w:hAnsi="Times New Roman"/>
+          <w:b/>
+          <w:sz w:val="24"/>
+        </w:rPr>
+        <w:t xml:space="preserve">5-jadval. O'zbekistonda agrar sohada fermer xo'jaliklariga ajratilgan yer maydonlari va ulardan foydalanish samaradorligi</w:t>
       </w:r>
     </w:p>
     <w:tbl>
@@ -3928,22 +3974,6 @@
     <w:p>
       <w:pPr>
         <w:pStyle w:val="style0"/>
-        <w:spacing w:before="0" w:after="0"/>
-        <w:jc w:val="center"/>
-        <w:rPr/>
-      </w:pPr>
-      <w:r>
-        <w:rPr>
-          <w:rFonts w:ascii="Times New Roman" w:hAnsi="Times New Roman"/>
-          <w:b/>
-          <w:sz w:val="24"/>
-        </w:rPr>
-        <w:t xml:space="preserve">5-jadval. O'zbekistonda agrar sohada fermer xo'jaliklariga ajratilgan yer maydonlari va ulardan foydalanish samaradorligi</w:t>
-      </w:r>
-    </w:p>
-    <w:p>
-      <w:pPr>
-        <w:pStyle w:val="style0"/>
         <w:spacing w:after="0" w:lineRule="auto" w:line="360" w:before="0"/>
         <w:ind w:firstLine="720"/>
         <w:jc w:val="both"/>
@@ -3971,6 +4001,23 @@
           <w:sz w:val="26"/>
         </w:rPr>
         <w:t>Mazkur tahlillar asosida sohaga oid asosiy ko'rsatkichlarni quyidagi jadvalda taqqoslash mumkin:</w:t>
+      </w:r>
+    </w:p>
+    <w:p>
+      <w:pPr>
+        <w:pStyle w:val="style0"/>
+        <w:keepNext/>
+        <w:spacing w:before="0" w:after="0"/>
+        <w:jc w:val="center"/>
+        <w:rPr/>
+      </w:pPr>
+      <w:r>
+        <w:rPr>
+          <w:rFonts w:ascii="Times New Roman" w:hAnsi="Times New Roman"/>
+          <w:b/>
+          <w:sz w:val="24"/>
+        </w:rPr>
+        <w:t xml:space="preserve">6-jadval. O'zbekistonda agrar munosabatlarni takomillashtirishning huquqiy-iqtisodiy mexanizmlari va zamonaviy yondashuvlari</w:t>
       </w:r>
     </w:p>
     <w:tbl>
@@ -4325,22 +4372,6 @@
     <w:p>
       <w:pPr>
         <w:pStyle w:val="style0"/>
-        <w:spacing w:before="0" w:after="0"/>
-        <w:jc w:val="center"/>
-        <w:rPr/>
-      </w:pPr>
-      <w:r>
-        <w:rPr>
-          <w:rFonts w:ascii="Times New Roman" w:hAnsi="Times New Roman"/>
-          <w:b/>
-          <w:sz w:val="24"/>
-        </w:rPr>
-        <w:t xml:space="preserve">6-jadval. O'zbekistonda agrar munosabatlarni takomillashtirishning huquqiy-iqtisodiy mexanizmlari va zamonaviy yondashuvlari</w:t>
-      </w:r>
-    </w:p>
-    <w:p>
-      <w:pPr>
-        <w:pStyle w:val="style0"/>
         <w:spacing w:after="0" w:lineRule="auto" w:line="360" w:before="0"/>
         <w:ind w:firstLine="720"/>
         <w:jc w:val="both"/>
@@ -4416,6 +4447,23 @@
           <w:vertAlign w:val="superscript"/>
         </w:rPr>
         <w:footnoteReference w:id="27"/>
+      </w:r>
+    </w:p>
+    <w:p>
+      <w:pPr>
+        <w:pStyle w:val="style0"/>
+        <w:keepNext/>
+        <w:spacing w:before="0" w:after="0"/>
+        <w:jc w:val="center"/>
+        <w:rPr/>
+      </w:pPr>
+      <w:r>
+        <w:rPr>
+          <w:rFonts w:ascii="Times New Roman" w:hAnsi="Times New Roman"/>
+          <w:b/>
+          <w:sz w:val="24"/>
+        </w:rPr>
+        <w:t xml:space="preserve">7-jadval. Fermer xo'jaliklari va qishloq xo'jaligi kooperativlarini rivojlantirishning istiqbolli yo'nalishlari</w:t>
       </w:r>
     </w:p>
     <w:tbl>
@@ -4896,22 +4944,6 @@
     <w:p>
       <w:pPr>
         <w:pStyle w:val="style0"/>
-        <w:spacing w:before="0" w:after="0"/>
-        <w:jc w:val="center"/>
-        <w:rPr/>
-      </w:pPr>
-      <w:r>
-        <w:rPr>
-          <w:rFonts w:ascii="Times New Roman" w:hAnsi="Times New Roman"/>
-          <w:b/>
-          <w:sz w:val="24"/>
-        </w:rPr>
-        <w:t xml:space="preserve">7-jadval. Fermer xo'jaliklari va qishloq xo'jaligi kooperativlarini rivojlantirishning istiqbolli yo'nalishlari</w:t>
-      </w:r>
-    </w:p>
-    <w:p>
-      <w:pPr>
-        <w:pStyle w:val="style0"/>
         <w:spacing w:after="0" w:lineRule="auto" w:line="360" w:before="0"/>
         <w:ind w:firstLine="720"/>
         <w:jc w:val="both"/>
@@ -5072,6 +5104,7 @@
     <w:p>
       <w:pPr>
         <w:pStyle w:val="style0"/>
+        <w:pageBreakBefore/>
         <w:spacing w:before="0" w:after="0"/>
         <w:jc w:val="center"/>
         <w:rPr/>
@@ -6372,6 +6405,32 @@
           <w:szCs w:val="20"/>
         </w:rPr>
         <w:t xml:space="preserve"> Abdullayev N.S., To'rayev A.A. Agrar iqtisodiyot asoslari. Toshkent: Yangi asr avlodi, 2018.</w:t>
+      </w:r>
+    </w:p>
+  </w:footnote>
+  <w:footnote w:id="34">
+    <w:p>
+      <w:pPr>
+        <w:pStyle w:val="FootnoteText"/>
+        <w:spacing w:after="0" w:line="240" w:lineRule="auto"/>
+        <w:jc w:val="both"/>
+      </w:pPr>
+      <w:r>
+        <w:rPr>
+          <w:rStyle w:val="FootnoteReference"/>
+          <w:vertAlign w:val="superscript"/>
+          <w:sz w:val="20"/>
+          <w:szCs w:val="20"/>
+        </w:rPr>
+        <w:footnoteRef/>
+      </w:r>
+      <w:r>
+        <w:rPr>
+          <w:rFonts w:ascii="Times New Roman" w:hAnsi="Times New Roman" w:cs="Times New Roman"/>
+          <w:sz w:val="20"/>
+          <w:szCs w:val="20"/>
+        </w:rPr>
+        <w:t xml:space="preserve"> Oʻzbekiston Respublikasi Prezidentining 2019-yil 23-oktabrdagi “Oʻzbekiston Respublikasi qishloq xoʻjaligini rivojlantirishning 2020–2030-yillarga moʻljallangan strategiyasini tasdiqlash toʻgʻrisida”gi PF-5853-son Farmoni. // www.lex.uz</w:t>
       </w:r>
     </w:p>
   </w:footnote>

</xml_diff>